<commit_message>
Cleanup codebase, untrack node_modules, and prepare for deployment
</commit_message>
<xml_diff>
--- a/Database Project Proposal .docx
+++ b/Database Project Proposal .docx
@@ -218,7 +218,6 @@
         <w:tc>
           <w:tcPr>
             <w:tcW w:w="5220" w:type="dxa"/>
-            <w:shd w:val="clear" w:color="auto" w:fill="auto"/>
             <w:tcMar>
               <w:top w:w="100" w:type="dxa"/>
               <w:left w:w="100" w:type="dxa"/>
@@ -263,7 +262,6 @@
         <w:tc>
           <w:tcPr>
             <w:tcW w:w="1860" w:type="dxa"/>
-            <w:shd w:val="clear" w:color="auto" w:fill="auto"/>
             <w:tcMar>
               <w:top w:w="100" w:type="dxa"/>
               <w:left w:w="100" w:type="dxa"/>
@@ -308,7 +306,6 @@
         <w:tc>
           <w:tcPr>
             <w:tcW w:w="2260" w:type="dxa"/>
-            <w:shd w:val="clear" w:color="auto" w:fill="auto"/>
             <w:tcMar>
               <w:top w:w="100" w:type="dxa"/>
               <w:left w:w="100" w:type="dxa"/>
@@ -358,7 +355,6 @@
         <w:tc>
           <w:tcPr>
             <w:tcW w:w="5220" w:type="dxa"/>
-            <w:shd w:val="clear" w:color="auto" w:fill="auto"/>
             <w:tcMar>
               <w:top w:w="100" w:type="dxa"/>
               <w:left w:w="100" w:type="dxa"/>
@@ -399,7 +395,6 @@
         <w:tc>
           <w:tcPr>
             <w:tcW w:w="1860" w:type="dxa"/>
-            <w:shd w:val="clear" w:color="auto" w:fill="auto"/>
             <w:tcMar>
               <w:top w:w="100" w:type="dxa"/>
               <w:left w:w="100" w:type="dxa"/>
@@ -467,7 +462,6 @@
         <w:tc>
           <w:tcPr>
             <w:tcW w:w="2260" w:type="dxa"/>
-            <w:shd w:val="clear" w:color="auto" w:fill="auto"/>
             <w:tcMar>
               <w:top w:w="100" w:type="dxa"/>
               <w:left w:w="100" w:type="dxa"/>
@@ -513,7 +507,6 @@
         <w:tc>
           <w:tcPr>
             <w:tcW w:w="5220" w:type="dxa"/>
-            <w:shd w:val="clear" w:color="auto" w:fill="auto"/>
             <w:tcMar>
               <w:top w:w="100" w:type="dxa"/>
               <w:left w:w="100" w:type="dxa"/>
@@ -552,7 +545,6 @@
         <w:tc>
           <w:tcPr>
             <w:tcW w:w="1860" w:type="dxa"/>
-            <w:shd w:val="clear" w:color="auto" w:fill="auto"/>
             <w:tcMar>
               <w:top w:w="100" w:type="dxa"/>
               <w:left w:w="100" w:type="dxa"/>
@@ -591,7 +583,6 @@
         <w:tc>
           <w:tcPr>
             <w:tcW w:w="2260" w:type="dxa"/>
-            <w:shd w:val="clear" w:color="auto" w:fill="auto"/>
             <w:tcMar>
               <w:top w:w="100" w:type="dxa"/>
               <w:left w:w="100" w:type="dxa"/>
@@ -635,7 +626,6 @@
         <w:tc>
           <w:tcPr>
             <w:tcW w:w="5220" w:type="dxa"/>
-            <w:shd w:val="clear" w:color="auto" w:fill="auto"/>
             <w:tcMar>
               <w:top w:w="100" w:type="dxa"/>
               <w:left w:w="100" w:type="dxa"/>
@@ -674,7 +664,6 @@
         <w:tc>
           <w:tcPr>
             <w:tcW w:w="1860" w:type="dxa"/>
-            <w:shd w:val="clear" w:color="auto" w:fill="auto"/>
             <w:tcMar>
               <w:top w:w="100" w:type="dxa"/>
               <w:left w:w="100" w:type="dxa"/>
@@ -713,7 +702,6 @@
         <w:tc>
           <w:tcPr>
             <w:tcW w:w="2260" w:type="dxa"/>
-            <w:shd w:val="clear" w:color="auto" w:fill="auto"/>
             <w:tcMar>
               <w:top w:w="100" w:type="dxa"/>
               <w:left w:w="100" w:type="dxa"/>
@@ -757,7 +745,6 @@
         <w:tc>
           <w:tcPr>
             <w:tcW w:w="5220" w:type="dxa"/>
-            <w:shd w:val="clear" w:color="auto" w:fill="auto"/>
             <w:tcMar>
               <w:top w:w="100" w:type="dxa"/>
               <w:left w:w="100" w:type="dxa"/>
@@ -787,7 +774,6 @@
         <w:tc>
           <w:tcPr>
             <w:tcW w:w="1860" w:type="dxa"/>
-            <w:shd w:val="clear" w:color="auto" w:fill="auto"/>
             <w:tcMar>
               <w:top w:w="100" w:type="dxa"/>
               <w:left w:w="100" w:type="dxa"/>
@@ -817,7 +803,6 @@
         <w:tc>
           <w:tcPr>
             <w:tcW w:w="2260" w:type="dxa"/>
-            <w:shd w:val="clear" w:color="auto" w:fill="auto"/>
             <w:tcMar>
               <w:top w:w="100" w:type="dxa"/>
               <w:left w:w="100" w:type="dxa"/>
@@ -2136,9 +2121,581 @@
           <w:sz w:val="32"/>
           <w:szCs w:val="32"/>
         </w:rPr>
-        <w:t>Technology Stack</w:t>
-      </w:r>
-      <w:r>
+        <w:t>Technology Stack:</w:t>
+      </w:r>
+    </w:p>
+    <w:p>
+      <w:pPr>
+        <w:widowControl w:val="0"/>
+        <w:pBdr>
+          <w:top w:val="nil"/>
+          <w:left w:val="nil"/>
+          <w:bottom w:val="nil"/>
+          <w:right w:val="nil"/>
+          <w:between w:val="nil"/>
+        </w:pBdr>
+        <w:spacing w:before="5" w:line="229" w:lineRule="auto"/>
+        <w:ind w:left="20" w:right="17"/>
+        <w:jc w:val="both"/>
+        <w:rPr>
+          <w:rFonts w:asciiTheme="majorHAnsi" w:eastAsia="Times New Roman" w:hAnsiTheme="majorHAnsi" w:cstheme="majorHAnsi"/>
+          <w:color w:val="000000"/>
+          <w:sz w:val="24"/>
+          <w:szCs w:val="24"/>
+        </w:rPr>
+      </w:pPr>
+      <w:r>
+        <w:rPr>
+          <w:rFonts w:asciiTheme="majorHAnsi" w:eastAsia="Times New Roman" w:hAnsiTheme="majorHAnsi" w:cstheme="majorHAnsi"/>
+          <w:color w:val="000000"/>
+          <w:sz w:val="24"/>
+          <w:szCs w:val="24"/>
+        </w:rPr>
+        <w:t>Here’s a suggested technology stack for building the system:</w:t>
+      </w:r>
+    </w:p>
+    <w:p>
+      <w:pPr>
+        <w:widowControl w:val="0"/>
+        <w:pBdr>
+          <w:top w:val="nil"/>
+          <w:left w:val="nil"/>
+          <w:bottom w:val="nil"/>
+          <w:right w:val="nil"/>
+          <w:between w:val="nil"/>
+        </w:pBdr>
+        <w:spacing w:before="5" w:line="229" w:lineRule="auto"/>
+        <w:ind w:left="20" w:right="17"/>
+        <w:jc w:val="both"/>
+        <w:rPr>
+          <w:rFonts w:asciiTheme="majorHAnsi" w:eastAsia="Times New Roman" w:hAnsiTheme="majorHAnsi" w:cstheme="majorHAnsi"/>
+          <w:color w:val="000000"/>
+          <w:sz w:val="24"/>
+          <w:szCs w:val="24"/>
+        </w:rPr>
+      </w:pPr>
+    </w:p>
+    <w:p>
+      <w:pPr>
+        <w:widowControl w:val="0"/>
+        <w:pBdr>
+          <w:top w:val="nil"/>
+          <w:left w:val="nil"/>
+          <w:bottom w:val="nil"/>
+          <w:right w:val="nil"/>
+          <w:between w:val="nil"/>
+        </w:pBdr>
+        <w:spacing w:before="5" w:line="229" w:lineRule="auto"/>
+        <w:ind w:left="20" w:right="17"/>
+        <w:jc w:val="both"/>
+        <w:rPr>
+          <w:rFonts w:asciiTheme="majorHAnsi" w:eastAsia="Times New Roman" w:hAnsiTheme="majorHAnsi" w:cstheme="majorHAnsi"/>
+          <w:b/>
+          <w:bCs/>
+          <w:color w:val="000000"/>
+          <w:sz w:val="24"/>
+          <w:szCs w:val="24"/>
+        </w:rPr>
+      </w:pPr>
+      <w:r>
+        <w:rPr>
+          <w:rFonts w:asciiTheme="majorHAnsi" w:eastAsia="Times New Roman" w:hAnsiTheme="majorHAnsi" w:cstheme="majorHAnsi"/>
+          <w:b/>
+          <w:bCs/>
+          <w:color w:val="000000"/>
+          <w:sz w:val="24"/>
+          <w:szCs w:val="24"/>
+        </w:rPr>
+        <w:t>Database</w:t>
+      </w:r>
+    </w:p>
+    <w:p>
+      <w:pPr>
+        <w:widowControl w:val="0"/>
+        <w:pBdr>
+          <w:top w:val="nil"/>
+          <w:left w:val="nil"/>
+          <w:bottom w:val="nil"/>
+          <w:right w:val="nil"/>
+          <w:between w:val="nil"/>
+        </w:pBdr>
+        <w:spacing w:before="5" w:line="229" w:lineRule="auto"/>
+        <w:ind w:left="20" w:right="17"/>
+        <w:jc w:val="both"/>
+        <w:rPr>
+          <w:rFonts w:asciiTheme="majorHAnsi" w:eastAsia="Times New Roman" w:hAnsiTheme="majorHAnsi" w:cstheme="majorHAnsi"/>
+          <w:b/>
+          <w:bCs/>
+          <w:color w:val="000000"/>
+          <w:sz w:val="24"/>
+          <w:szCs w:val="24"/>
+        </w:rPr>
+      </w:pPr>
+    </w:p>
+    <w:p>
+      <w:pPr>
+        <w:widowControl w:val="0"/>
+        <w:numPr>
+          <w:ilvl w:val="0"/>
+          <w:numId w:val="9"/>
+        </w:numPr>
+        <w:pBdr>
+          <w:top w:val="nil"/>
+          <w:left w:val="nil"/>
+          <w:bottom w:val="nil"/>
+          <w:right w:val="nil"/>
+          <w:between w:val="nil"/>
+        </w:pBdr>
+        <w:spacing w:before="5" w:line="229" w:lineRule="auto"/>
+        <w:ind w:right="17"/>
+        <w:jc w:val="both"/>
+        <w:rPr>
+          <w:rFonts w:asciiTheme="majorHAnsi" w:eastAsia="Times New Roman" w:hAnsiTheme="majorHAnsi" w:cstheme="majorHAnsi"/>
+          <w:color w:val="000000"/>
+          <w:sz w:val="24"/>
+          <w:szCs w:val="24"/>
+        </w:rPr>
+      </w:pPr>
+      <w:r>
+        <w:rPr>
+          <w:rFonts w:asciiTheme="majorHAnsi" w:eastAsia="Times New Roman" w:hAnsiTheme="majorHAnsi" w:cstheme="majorHAnsi"/>
+          <w:b/>
+          <w:bCs/>
+          <w:color w:val="000000"/>
+          <w:sz w:val="24"/>
+          <w:szCs w:val="24"/>
+        </w:rPr>
+        <w:t>Relational Database:</w:t>
+      </w:r>
+      <w:r>
+        <w:rPr>
+          <w:rFonts w:asciiTheme="majorHAnsi" w:eastAsia="Times New Roman" w:hAnsiTheme="majorHAnsi" w:cstheme="majorHAnsi"/>
+          <w:color w:val="000000"/>
+          <w:sz w:val="24"/>
+          <w:szCs w:val="24"/>
+        </w:rPr>
+        <w:t> Microsoft SQL Server for structured data storage.</w:t>
+      </w:r>
+    </w:p>
+    <w:p>
+      <w:pPr>
+        <w:widowControl w:val="0"/>
+        <w:pBdr>
+          <w:top w:val="nil"/>
+          <w:left w:val="nil"/>
+          <w:bottom w:val="nil"/>
+          <w:right w:val="nil"/>
+          <w:between w:val="nil"/>
+        </w:pBdr>
+        <w:spacing w:before="5" w:line="229" w:lineRule="auto"/>
+        <w:ind w:left="20" w:right="17"/>
+        <w:jc w:val="both"/>
+        <w:rPr>
+          <w:rFonts w:asciiTheme="majorHAnsi" w:eastAsia="Times New Roman" w:hAnsiTheme="majorHAnsi" w:cstheme="majorHAnsi"/>
+          <w:b/>
+          <w:bCs/>
+          <w:color w:val="000000"/>
+          <w:sz w:val="24"/>
+          <w:szCs w:val="24"/>
+        </w:rPr>
+      </w:pPr>
+      <w:r>
+        <w:rPr>
+          <w:rFonts w:asciiTheme="majorHAnsi" w:eastAsia="Times New Roman" w:hAnsiTheme="majorHAnsi" w:cstheme="majorHAnsi"/>
+          <w:b/>
+          <w:bCs/>
+          <w:color w:val="000000"/>
+          <w:sz w:val="24"/>
+          <w:szCs w:val="24"/>
+        </w:rPr>
+        <w:t>Backend</w:t>
+      </w:r>
+    </w:p>
+    <w:p>
+      <w:pPr>
+        <w:widowControl w:val="0"/>
+        <w:pBdr>
+          <w:top w:val="nil"/>
+          <w:left w:val="nil"/>
+          <w:bottom w:val="nil"/>
+          <w:right w:val="nil"/>
+          <w:between w:val="nil"/>
+        </w:pBdr>
+        <w:spacing w:before="5" w:line="229" w:lineRule="auto"/>
+        <w:ind w:left="20" w:right="17"/>
+        <w:jc w:val="both"/>
+        <w:rPr>
+          <w:rFonts w:asciiTheme="majorHAnsi" w:eastAsia="Times New Roman" w:hAnsiTheme="majorHAnsi" w:cstheme="majorHAnsi"/>
+          <w:b/>
+          <w:bCs/>
+          <w:color w:val="000000"/>
+          <w:sz w:val="24"/>
+          <w:szCs w:val="24"/>
+        </w:rPr>
+      </w:pPr>
+    </w:p>
+    <w:p>
+      <w:pPr>
+        <w:widowControl w:val="0"/>
+        <w:numPr>
+          <w:ilvl w:val="0"/>
+          <w:numId w:val="10"/>
+        </w:numPr>
+        <w:pBdr>
+          <w:top w:val="nil"/>
+          <w:left w:val="nil"/>
+          <w:bottom w:val="nil"/>
+          <w:right w:val="nil"/>
+          <w:between w:val="nil"/>
+        </w:pBdr>
+        <w:spacing w:before="5" w:line="229" w:lineRule="auto"/>
+        <w:ind w:right="17"/>
+        <w:jc w:val="both"/>
+        <w:rPr>
+          <w:rFonts w:asciiTheme="majorHAnsi" w:eastAsia="Times New Roman" w:hAnsiTheme="majorHAnsi" w:cstheme="majorHAnsi"/>
+          <w:color w:val="000000"/>
+          <w:sz w:val="24"/>
+          <w:szCs w:val="24"/>
+        </w:rPr>
+      </w:pPr>
+      <w:r>
+        <w:rPr>
+          <w:rFonts w:asciiTheme="majorHAnsi" w:eastAsia="Times New Roman" w:hAnsiTheme="majorHAnsi" w:cstheme="majorHAnsi"/>
+          <w:b/>
+          <w:bCs/>
+          <w:color w:val="000000"/>
+          <w:sz w:val="24"/>
+          <w:szCs w:val="24"/>
+        </w:rPr>
+        <w:t>Programming Language:</w:t>
+      </w:r>
+      <w:r>
+        <w:rPr>
+          <w:rFonts w:asciiTheme="majorHAnsi" w:eastAsia="Times New Roman" w:hAnsiTheme="majorHAnsi" w:cstheme="majorHAnsi"/>
+          <w:color w:val="000000"/>
+          <w:sz w:val="24"/>
+          <w:szCs w:val="24"/>
+        </w:rPr>
+        <w:t> Python, Node.js.</w:t>
+      </w:r>
+    </w:p>
+    <w:p>
+      <w:pPr>
+        <w:widowControl w:val="0"/>
+        <w:pBdr>
+          <w:top w:val="nil"/>
+          <w:left w:val="nil"/>
+          <w:bottom w:val="nil"/>
+          <w:right w:val="nil"/>
+          <w:between w:val="nil"/>
+        </w:pBdr>
+        <w:spacing w:before="5" w:line="229" w:lineRule="auto"/>
+        <w:ind w:left="720" w:right="17"/>
+        <w:jc w:val="both"/>
+        <w:rPr>
+          <w:rFonts w:asciiTheme="majorHAnsi" w:eastAsia="Times New Roman" w:hAnsiTheme="majorHAnsi" w:cstheme="majorHAnsi"/>
+          <w:color w:val="000000"/>
+          <w:sz w:val="24"/>
+          <w:szCs w:val="24"/>
+        </w:rPr>
+      </w:pPr>
+    </w:p>
+    <w:p>
+      <w:pPr>
+        <w:widowControl w:val="0"/>
+        <w:pBdr>
+          <w:top w:val="nil"/>
+          <w:left w:val="nil"/>
+          <w:bottom w:val="nil"/>
+          <w:right w:val="nil"/>
+          <w:between w:val="nil"/>
+        </w:pBdr>
+        <w:spacing w:before="5" w:line="229" w:lineRule="auto"/>
+        <w:ind w:left="20" w:right="17"/>
+        <w:jc w:val="both"/>
+        <w:rPr>
+          <w:rFonts w:asciiTheme="majorHAnsi" w:eastAsia="Times New Roman" w:hAnsiTheme="majorHAnsi" w:cstheme="majorHAnsi"/>
+          <w:b/>
+          <w:bCs/>
+          <w:color w:val="000000"/>
+          <w:sz w:val="24"/>
+          <w:szCs w:val="24"/>
+        </w:rPr>
+      </w:pPr>
+      <w:r>
+        <w:rPr>
+          <w:rFonts w:asciiTheme="majorHAnsi" w:eastAsia="Times New Roman" w:hAnsiTheme="majorHAnsi" w:cstheme="majorHAnsi"/>
+          <w:b/>
+          <w:bCs/>
+          <w:color w:val="000000"/>
+          <w:sz w:val="24"/>
+          <w:szCs w:val="24"/>
+        </w:rPr>
+        <w:t>Frontend</w:t>
+      </w:r>
+    </w:p>
+    <w:p>
+      <w:pPr>
+        <w:widowControl w:val="0"/>
+        <w:pBdr>
+          <w:top w:val="nil"/>
+          <w:left w:val="nil"/>
+          <w:bottom w:val="nil"/>
+          <w:right w:val="nil"/>
+          <w:between w:val="nil"/>
+        </w:pBdr>
+        <w:spacing w:before="5" w:line="229" w:lineRule="auto"/>
+        <w:ind w:left="20" w:right="17"/>
+        <w:jc w:val="both"/>
+        <w:rPr>
+          <w:rFonts w:asciiTheme="majorHAnsi" w:eastAsia="Times New Roman" w:hAnsiTheme="majorHAnsi" w:cstheme="majorHAnsi"/>
+          <w:b/>
+          <w:bCs/>
+          <w:color w:val="000000"/>
+          <w:sz w:val="24"/>
+          <w:szCs w:val="24"/>
+        </w:rPr>
+      </w:pPr>
+    </w:p>
+    <w:p>
+      <w:pPr>
+        <w:widowControl w:val="0"/>
+        <w:numPr>
+          <w:ilvl w:val="0"/>
+          <w:numId w:val="11"/>
+        </w:numPr>
+        <w:pBdr>
+          <w:top w:val="nil"/>
+          <w:left w:val="nil"/>
+          <w:bottom w:val="nil"/>
+          <w:right w:val="nil"/>
+          <w:between w:val="nil"/>
+        </w:pBdr>
+        <w:spacing w:before="5" w:line="229" w:lineRule="auto"/>
+        <w:ind w:right="17"/>
+        <w:jc w:val="both"/>
+        <w:rPr>
+          <w:rFonts w:asciiTheme="majorHAnsi" w:eastAsia="Times New Roman" w:hAnsiTheme="majorHAnsi" w:cstheme="majorHAnsi"/>
+          <w:color w:val="000000"/>
+          <w:sz w:val="24"/>
+          <w:szCs w:val="24"/>
+        </w:rPr>
+      </w:pPr>
+      <w:r>
+        <w:rPr>
+          <w:rFonts w:asciiTheme="majorHAnsi" w:eastAsia="Times New Roman" w:hAnsiTheme="majorHAnsi" w:cstheme="majorHAnsi"/>
+          <w:b/>
+          <w:bCs/>
+          <w:color w:val="000000"/>
+          <w:sz w:val="24"/>
+          <w:szCs w:val="24"/>
+        </w:rPr>
+        <w:t>Web Framework:</w:t>
+      </w:r>
+      <w:r>
+        <w:rPr>
+          <w:rFonts w:asciiTheme="majorHAnsi" w:eastAsia="Times New Roman" w:hAnsiTheme="majorHAnsi" w:cstheme="majorHAnsi"/>
+          <w:color w:val="000000"/>
+          <w:sz w:val="24"/>
+          <w:szCs w:val="24"/>
+        </w:rPr>
+        <w:t> React.js</w:t>
+      </w:r>
+      <w:r>
+        <w:rPr>
+          <w:rFonts w:asciiTheme="majorHAnsi" w:eastAsia="Times New Roman" w:hAnsiTheme="majorHAnsi" w:cstheme="majorHAnsi"/>
+          <w:color w:val="000000"/>
+          <w:sz w:val="24"/>
+          <w:szCs w:val="24"/>
+        </w:rPr>
+        <w:t xml:space="preserve"> </w:t>
+      </w:r>
+    </w:p>
+    <w:p>
+      <w:pPr>
+        <w:widowControl w:val="0"/>
+        <w:pBdr>
+          <w:top w:val="nil"/>
+          <w:left w:val="nil"/>
+          <w:bottom w:val="nil"/>
+          <w:right w:val="nil"/>
+          <w:between w:val="nil"/>
+        </w:pBdr>
+        <w:spacing w:before="5" w:line="229" w:lineRule="auto"/>
+        <w:ind w:left="360" w:right="17"/>
+        <w:jc w:val="both"/>
+        <w:rPr>
+          <w:rFonts w:asciiTheme="majorHAnsi" w:eastAsia="Times New Roman" w:hAnsiTheme="majorHAnsi" w:cstheme="majorHAnsi"/>
+          <w:color w:val="000000"/>
+          <w:sz w:val="24"/>
+          <w:szCs w:val="24"/>
+        </w:rPr>
+      </w:pPr>
+    </w:p>
+    <w:p>
+      <w:pPr>
+        <w:widowControl w:val="0"/>
+        <w:pBdr>
+          <w:top w:val="nil"/>
+          <w:left w:val="nil"/>
+          <w:bottom w:val="nil"/>
+          <w:right w:val="nil"/>
+          <w:between w:val="nil"/>
+        </w:pBdr>
+        <w:spacing w:before="5" w:line="229" w:lineRule="auto"/>
+        <w:ind w:right="17"/>
+        <w:jc w:val="both"/>
+        <w:rPr>
+          <w:rFonts w:asciiTheme="majorHAnsi" w:eastAsia="Times New Roman" w:hAnsiTheme="majorHAnsi" w:cstheme="majorHAnsi"/>
+          <w:color w:val="000000"/>
+          <w:sz w:val="24"/>
+          <w:szCs w:val="24"/>
+        </w:rPr>
+      </w:pPr>
+      <w:r>
+        <w:rPr>
+          <w:rFonts w:asciiTheme="majorHAnsi" w:eastAsia="Times New Roman" w:hAnsiTheme="majorHAnsi" w:cstheme="majorHAnsi"/>
+          <w:b/>
+          <w:bCs/>
+          <w:color w:val="000000"/>
+          <w:sz w:val="24"/>
+          <w:szCs w:val="24"/>
+        </w:rPr>
+        <w:t xml:space="preserve">Cloud Integration: </w:t>
+      </w:r>
+      <w:r>
+        <w:rPr>
+          <w:rFonts w:asciiTheme="majorHAnsi" w:eastAsia="Times New Roman" w:hAnsiTheme="majorHAnsi" w:cstheme="majorHAnsi"/>
+          <w:color w:val="000000"/>
+          <w:sz w:val="24"/>
+          <w:szCs w:val="24"/>
+        </w:rPr>
+        <w:t>Not decided yet</w:t>
+      </w:r>
+    </w:p>
+    <w:p>
+      <w:pPr>
+        <w:widowControl w:val="0"/>
+        <w:pBdr>
+          <w:top w:val="nil"/>
+          <w:left w:val="nil"/>
+          <w:bottom w:val="nil"/>
+          <w:right w:val="nil"/>
+          <w:between w:val="nil"/>
+        </w:pBdr>
+        <w:spacing w:before="5" w:line="229" w:lineRule="auto"/>
+        <w:ind w:left="20" w:right="17"/>
+        <w:jc w:val="both"/>
+        <w:rPr>
+          <w:rFonts w:asciiTheme="majorHAnsi" w:eastAsia="Times New Roman" w:hAnsiTheme="majorHAnsi" w:cstheme="majorHAnsi"/>
+          <w:b/>
+          <w:bCs/>
+          <w:color w:val="000000"/>
+          <w:sz w:val="24"/>
+          <w:szCs w:val="24"/>
+        </w:rPr>
+      </w:pPr>
+    </w:p>
+    <w:p>
+      <w:pPr>
+        <w:widowControl w:val="0"/>
+        <w:pBdr>
+          <w:top w:val="nil"/>
+          <w:left w:val="nil"/>
+          <w:bottom w:val="nil"/>
+          <w:right w:val="nil"/>
+          <w:between w:val="nil"/>
+        </w:pBdr>
+        <w:spacing w:before="5" w:line="229" w:lineRule="auto"/>
+        <w:ind w:right="17"/>
+        <w:jc w:val="both"/>
+        <w:rPr>
+          <w:rFonts w:asciiTheme="majorHAnsi" w:eastAsia="Times New Roman" w:hAnsiTheme="majorHAnsi" w:cstheme="majorHAnsi"/>
+          <w:b/>
+          <w:bCs/>
+          <w:color w:val="000000"/>
+          <w:sz w:val="24"/>
+          <w:szCs w:val="24"/>
+        </w:rPr>
+      </w:pPr>
+      <w:r>
+        <w:rPr>
+          <w:rFonts w:asciiTheme="majorHAnsi" w:eastAsia="Times New Roman" w:hAnsiTheme="majorHAnsi" w:cstheme="majorHAnsi"/>
+          <w:b/>
+          <w:bCs/>
+          <w:color w:val="000000"/>
+          <w:sz w:val="24"/>
+          <w:szCs w:val="24"/>
+        </w:rPr>
+        <w:t xml:space="preserve">AI Integration: </w:t>
+      </w:r>
+      <w:r>
+        <w:rPr>
+          <w:rFonts w:asciiTheme="majorHAnsi" w:eastAsia="Times New Roman" w:hAnsiTheme="majorHAnsi" w:cstheme="majorHAnsi"/>
+          <w:color w:val="000000"/>
+          <w:sz w:val="24"/>
+          <w:szCs w:val="24"/>
+        </w:rPr>
+        <w:t>Not decided yet</w:t>
+      </w:r>
+    </w:p>
+    <w:p>
+      <w:pPr>
+        <w:widowControl w:val="0"/>
+        <w:pBdr>
+          <w:top w:val="nil"/>
+          <w:left w:val="nil"/>
+          <w:bottom w:val="nil"/>
+          <w:right w:val="nil"/>
+          <w:between w:val="nil"/>
+        </w:pBdr>
+        <w:spacing w:before="5" w:line="229" w:lineRule="auto"/>
+        <w:ind w:left="20" w:right="17"/>
+        <w:jc w:val="both"/>
+        <w:rPr>
+          <w:rFonts w:ascii="Times New Roman" w:eastAsia="Times New Roman" w:hAnsi="Times New Roman" w:cs="Times New Roman"/>
+          <w:b/>
+          <w:bCs/>
+          <w:color w:val="000000"/>
+          <w:sz w:val="24"/>
+          <w:szCs w:val="24"/>
+        </w:rPr>
+      </w:pPr>
+    </w:p>
+    <w:p>
+      <w:pPr>
+        <w:widowControl w:val="0"/>
+        <w:pBdr>
+          <w:top w:val="nil"/>
+          <w:left w:val="nil"/>
+          <w:bottom w:val="nil"/>
+          <w:right w:val="nil"/>
+          <w:between w:val="nil"/>
+        </w:pBdr>
+        <w:spacing w:before="5" w:line="229" w:lineRule="auto"/>
+        <w:ind w:left="720" w:right="17"/>
+        <w:jc w:val="both"/>
+        <w:rPr>
+          <w:rFonts w:ascii="Times New Roman" w:eastAsia="Times New Roman" w:hAnsi="Times New Roman" w:cs="Times New Roman"/>
+          <w:color w:val="000000"/>
+          <w:sz w:val="24"/>
+          <w:szCs w:val="24"/>
+        </w:rPr>
+      </w:pPr>
+    </w:p>
+    <w:p>
+      <w:pPr>
+        <w:widowControl w:val="0"/>
+        <w:pBdr>
+          <w:top w:val="nil"/>
+          <w:left w:val="nil"/>
+          <w:bottom w:val="nil"/>
+          <w:right w:val="nil"/>
+          <w:between w:val="nil"/>
+        </w:pBdr>
+        <w:spacing w:before="5" w:line="229" w:lineRule="auto"/>
+        <w:ind w:left="20" w:right="17"/>
+        <w:jc w:val="both"/>
         <w:rPr>
           <w:rFonts w:asciiTheme="majorHAnsi" w:eastAsia="Times New Roman" w:hAnsiTheme="majorHAnsi" w:cstheme="majorHAnsi"/>
           <w:b/>
@@ -2147,643 +2704,8 @@
           <w:sz w:val="32"/>
           <w:szCs w:val="32"/>
         </w:rPr>
-        <w:t>:</w:t>
-      </w:r>
-    </w:p>
-    <w:p>
-      <w:pPr>
-        <w:widowControl w:val="0"/>
-        <w:pBdr>
-          <w:top w:val="nil"/>
-          <w:left w:val="nil"/>
-          <w:bottom w:val="nil"/>
-          <w:right w:val="nil"/>
-          <w:between w:val="nil"/>
-        </w:pBdr>
-        <w:spacing w:before="5" w:line="229" w:lineRule="auto"/>
-        <w:ind w:left="20" w:right="17"/>
-        <w:jc w:val="both"/>
-        <w:rPr>
-          <w:rFonts w:asciiTheme="majorHAnsi" w:eastAsia="Times New Roman" w:hAnsiTheme="majorHAnsi" w:cstheme="majorHAnsi"/>
-          <w:color w:val="000000"/>
-          <w:sz w:val="24"/>
-          <w:szCs w:val="24"/>
-        </w:rPr>
-      </w:pPr>
-      <w:r>
-        <w:rPr>
-          <w:rFonts w:asciiTheme="majorHAnsi" w:eastAsia="Times New Roman" w:hAnsiTheme="majorHAnsi" w:cstheme="majorHAnsi"/>
-          <w:color w:val="000000"/>
-          <w:sz w:val="24"/>
-          <w:szCs w:val="24"/>
-        </w:rPr>
-        <w:t>Here’s a suggested technology stack for building the system:</w:t>
-      </w:r>
-    </w:p>
-    <w:p>
-      <w:pPr>
-        <w:widowControl w:val="0"/>
-        <w:pBdr>
-          <w:top w:val="nil"/>
-          <w:left w:val="nil"/>
-          <w:bottom w:val="nil"/>
-          <w:right w:val="nil"/>
-          <w:between w:val="nil"/>
-        </w:pBdr>
-        <w:spacing w:before="5" w:line="229" w:lineRule="auto"/>
-        <w:ind w:left="20" w:right="17"/>
-        <w:jc w:val="both"/>
-        <w:rPr>
-          <w:rFonts w:asciiTheme="majorHAnsi" w:eastAsia="Times New Roman" w:hAnsiTheme="majorHAnsi" w:cstheme="majorHAnsi"/>
-          <w:color w:val="000000"/>
-          <w:sz w:val="24"/>
-          <w:szCs w:val="24"/>
-        </w:rPr>
-      </w:pPr>
-    </w:p>
-    <w:p>
-      <w:pPr>
-        <w:widowControl w:val="0"/>
-        <w:pBdr>
-          <w:top w:val="nil"/>
-          <w:left w:val="nil"/>
-          <w:bottom w:val="nil"/>
-          <w:right w:val="nil"/>
-          <w:between w:val="nil"/>
-        </w:pBdr>
-        <w:spacing w:before="5" w:line="229" w:lineRule="auto"/>
-        <w:ind w:left="20" w:right="17"/>
-        <w:jc w:val="both"/>
-        <w:rPr>
-          <w:rFonts w:asciiTheme="majorHAnsi" w:eastAsia="Times New Roman" w:hAnsiTheme="majorHAnsi" w:cstheme="majorHAnsi"/>
-          <w:b/>
-          <w:bCs/>
-          <w:color w:val="000000"/>
-          <w:sz w:val="24"/>
-          <w:szCs w:val="24"/>
-        </w:rPr>
-      </w:pPr>
-      <w:r>
-        <w:rPr>
-          <w:rFonts w:asciiTheme="majorHAnsi" w:eastAsia="Times New Roman" w:hAnsiTheme="majorHAnsi" w:cstheme="majorHAnsi"/>
-          <w:b/>
-          <w:bCs/>
-          <w:color w:val="000000"/>
-          <w:sz w:val="24"/>
-          <w:szCs w:val="24"/>
-        </w:rPr>
-        <w:t>Database</w:t>
-      </w:r>
-    </w:p>
-    <w:p>
-      <w:pPr>
-        <w:widowControl w:val="0"/>
-        <w:pBdr>
-          <w:top w:val="nil"/>
-          <w:left w:val="nil"/>
-          <w:bottom w:val="nil"/>
-          <w:right w:val="nil"/>
-          <w:between w:val="nil"/>
-        </w:pBdr>
-        <w:spacing w:before="5" w:line="229" w:lineRule="auto"/>
-        <w:ind w:left="20" w:right="17"/>
-        <w:jc w:val="both"/>
-        <w:rPr>
-          <w:rFonts w:asciiTheme="majorHAnsi" w:eastAsia="Times New Roman" w:hAnsiTheme="majorHAnsi" w:cstheme="majorHAnsi"/>
-          <w:b/>
-          <w:bCs/>
-          <w:color w:val="000000"/>
-          <w:sz w:val="24"/>
-          <w:szCs w:val="24"/>
-        </w:rPr>
-      </w:pPr>
-    </w:p>
-    <w:p>
-      <w:pPr>
-        <w:widowControl w:val="0"/>
-        <w:numPr>
-          <w:ilvl w:val="0"/>
-          <w:numId w:val="9"/>
-        </w:numPr>
-        <w:pBdr>
-          <w:top w:val="nil"/>
-          <w:left w:val="nil"/>
-          <w:bottom w:val="nil"/>
-          <w:right w:val="nil"/>
-          <w:between w:val="nil"/>
-        </w:pBdr>
-        <w:spacing w:before="5" w:line="229" w:lineRule="auto"/>
-        <w:ind w:right="17"/>
-        <w:jc w:val="both"/>
-        <w:rPr>
-          <w:rFonts w:asciiTheme="majorHAnsi" w:eastAsia="Times New Roman" w:hAnsiTheme="majorHAnsi" w:cstheme="majorHAnsi"/>
-          <w:color w:val="000000"/>
-          <w:sz w:val="24"/>
-          <w:szCs w:val="24"/>
-        </w:rPr>
-      </w:pPr>
-      <w:r>
-        <w:rPr>
-          <w:rFonts w:asciiTheme="majorHAnsi" w:eastAsia="Times New Roman" w:hAnsiTheme="majorHAnsi" w:cstheme="majorHAnsi"/>
-          <w:b/>
-          <w:bCs/>
-          <w:color w:val="000000"/>
-          <w:sz w:val="24"/>
-          <w:szCs w:val="24"/>
-        </w:rPr>
-        <w:t>Relational Database:</w:t>
-      </w:r>
-      <w:r>
-        <w:rPr>
-          <w:rFonts w:asciiTheme="majorHAnsi" w:eastAsia="Times New Roman" w:hAnsiTheme="majorHAnsi" w:cstheme="majorHAnsi"/>
-          <w:color w:val="000000"/>
-          <w:sz w:val="24"/>
-          <w:szCs w:val="24"/>
-        </w:rPr>
-        <w:t> Microsoft SQL Server for structured data storage.</w:t>
-      </w:r>
-    </w:p>
-    <w:p>
-      <w:pPr>
-        <w:widowControl w:val="0"/>
-        <w:pBdr>
-          <w:top w:val="nil"/>
-          <w:left w:val="nil"/>
-          <w:bottom w:val="nil"/>
-          <w:right w:val="nil"/>
-          <w:between w:val="nil"/>
-        </w:pBdr>
-        <w:spacing w:before="5" w:line="229" w:lineRule="auto"/>
-        <w:ind w:left="20" w:right="17"/>
-        <w:jc w:val="both"/>
-        <w:rPr>
-          <w:rFonts w:asciiTheme="majorHAnsi" w:eastAsia="Times New Roman" w:hAnsiTheme="majorHAnsi" w:cstheme="majorHAnsi"/>
-          <w:b/>
-          <w:bCs/>
-          <w:color w:val="000000"/>
-          <w:sz w:val="24"/>
-          <w:szCs w:val="24"/>
-        </w:rPr>
-      </w:pPr>
-      <w:r>
-        <w:rPr>
-          <w:rFonts w:asciiTheme="majorHAnsi" w:eastAsia="Times New Roman" w:hAnsiTheme="majorHAnsi" w:cstheme="majorHAnsi"/>
-          <w:b/>
-          <w:bCs/>
-          <w:color w:val="000000"/>
-          <w:sz w:val="24"/>
-          <w:szCs w:val="24"/>
-        </w:rPr>
-        <w:t>Backend</w:t>
-      </w:r>
-    </w:p>
-    <w:p>
-      <w:pPr>
-        <w:widowControl w:val="0"/>
-        <w:pBdr>
-          <w:top w:val="nil"/>
-          <w:left w:val="nil"/>
-          <w:bottom w:val="nil"/>
-          <w:right w:val="nil"/>
-          <w:between w:val="nil"/>
-        </w:pBdr>
-        <w:spacing w:before="5" w:line="229" w:lineRule="auto"/>
-        <w:ind w:left="20" w:right="17"/>
-        <w:jc w:val="both"/>
-        <w:rPr>
-          <w:rFonts w:asciiTheme="majorHAnsi" w:eastAsia="Times New Roman" w:hAnsiTheme="majorHAnsi" w:cstheme="majorHAnsi"/>
-          <w:b/>
-          <w:bCs/>
-          <w:color w:val="000000"/>
-          <w:sz w:val="24"/>
-          <w:szCs w:val="24"/>
-        </w:rPr>
-      </w:pPr>
-    </w:p>
-    <w:p>
-      <w:pPr>
-        <w:widowControl w:val="0"/>
-        <w:numPr>
-          <w:ilvl w:val="0"/>
-          <w:numId w:val="10"/>
-        </w:numPr>
-        <w:pBdr>
-          <w:top w:val="nil"/>
-          <w:left w:val="nil"/>
-          <w:bottom w:val="nil"/>
-          <w:right w:val="nil"/>
-          <w:between w:val="nil"/>
-        </w:pBdr>
-        <w:spacing w:before="5" w:line="229" w:lineRule="auto"/>
-        <w:ind w:right="17"/>
-        <w:jc w:val="both"/>
-        <w:rPr>
-          <w:rFonts w:asciiTheme="majorHAnsi" w:eastAsia="Times New Roman" w:hAnsiTheme="majorHAnsi" w:cstheme="majorHAnsi"/>
-          <w:color w:val="000000"/>
-          <w:sz w:val="24"/>
-          <w:szCs w:val="24"/>
-        </w:rPr>
-      </w:pPr>
-      <w:r>
-        <w:rPr>
-          <w:rFonts w:asciiTheme="majorHAnsi" w:eastAsia="Times New Roman" w:hAnsiTheme="majorHAnsi" w:cstheme="majorHAnsi"/>
-          <w:b/>
-          <w:bCs/>
-          <w:color w:val="000000"/>
-          <w:sz w:val="24"/>
-          <w:szCs w:val="24"/>
-        </w:rPr>
-        <w:t>Programming Language:</w:t>
-      </w:r>
-      <w:r>
-        <w:rPr>
-          <w:rFonts w:asciiTheme="majorHAnsi" w:eastAsia="Times New Roman" w:hAnsiTheme="majorHAnsi" w:cstheme="majorHAnsi"/>
-          <w:color w:val="000000"/>
-          <w:sz w:val="24"/>
-          <w:szCs w:val="24"/>
-        </w:rPr>
-        <w:t> </w:t>
-      </w:r>
-      <w:r>
-        <w:rPr>
-          <w:rFonts w:asciiTheme="majorHAnsi" w:eastAsia="Times New Roman" w:hAnsiTheme="majorHAnsi" w:cstheme="majorHAnsi"/>
-          <w:color w:val="000000"/>
-          <w:sz w:val="24"/>
-          <w:szCs w:val="24"/>
-        </w:rPr>
-        <w:t>Python,</w:t>
-      </w:r>
-      <w:r>
-        <w:rPr>
-          <w:rFonts w:asciiTheme="majorHAnsi" w:eastAsia="Times New Roman" w:hAnsiTheme="majorHAnsi" w:cstheme="majorHAnsi"/>
-          <w:color w:val="000000"/>
-          <w:sz w:val="24"/>
-          <w:szCs w:val="24"/>
-        </w:rPr>
-        <w:t xml:space="preserve"> Node.js.</w:t>
-      </w:r>
-    </w:p>
-    <w:p>
-      <w:pPr>
-        <w:widowControl w:val="0"/>
-        <w:pBdr>
-          <w:top w:val="nil"/>
-          <w:left w:val="nil"/>
-          <w:bottom w:val="nil"/>
-          <w:right w:val="nil"/>
-          <w:between w:val="nil"/>
-        </w:pBdr>
-        <w:spacing w:before="5" w:line="229" w:lineRule="auto"/>
-        <w:ind w:left="720" w:right="17"/>
-        <w:jc w:val="both"/>
-        <w:rPr>
-          <w:rFonts w:asciiTheme="majorHAnsi" w:eastAsia="Times New Roman" w:hAnsiTheme="majorHAnsi" w:cstheme="majorHAnsi"/>
-          <w:color w:val="000000"/>
-          <w:sz w:val="24"/>
-          <w:szCs w:val="24"/>
-        </w:rPr>
-      </w:pPr>
-    </w:p>
-    <w:p>
-      <w:pPr>
-        <w:widowControl w:val="0"/>
-        <w:pBdr>
-          <w:top w:val="nil"/>
-          <w:left w:val="nil"/>
-          <w:bottom w:val="nil"/>
-          <w:right w:val="nil"/>
-          <w:between w:val="nil"/>
-        </w:pBdr>
-        <w:spacing w:before="5" w:line="229" w:lineRule="auto"/>
-        <w:ind w:left="20" w:right="17"/>
-        <w:jc w:val="both"/>
-        <w:rPr>
-          <w:rFonts w:asciiTheme="majorHAnsi" w:eastAsia="Times New Roman" w:hAnsiTheme="majorHAnsi" w:cstheme="majorHAnsi"/>
-          <w:b/>
-          <w:bCs/>
-          <w:color w:val="000000"/>
-          <w:sz w:val="24"/>
-          <w:szCs w:val="24"/>
-        </w:rPr>
-      </w:pPr>
-      <w:r>
-        <w:rPr>
-          <w:rFonts w:asciiTheme="majorHAnsi" w:eastAsia="Times New Roman" w:hAnsiTheme="majorHAnsi" w:cstheme="majorHAnsi"/>
-          <w:b/>
-          <w:bCs/>
-          <w:color w:val="000000"/>
-          <w:sz w:val="24"/>
-          <w:szCs w:val="24"/>
-        </w:rPr>
-        <w:t>Frontend</w:t>
-      </w:r>
-    </w:p>
-    <w:p>
-      <w:pPr>
-        <w:widowControl w:val="0"/>
-        <w:pBdr>
-          <w:top w:val="nil"/>
-          <w:left w:val="nil"/>
-          <w:bottom w:val="nil"/>
-          <w:right w:val="nil"/>
-          <w:between w:val="nil"/>
-        </w:pBdr>
-        <w:spacing w:before="5" w:line="229" w:lineRule="auto"/>
-        <w:ind w:left="20" w:right="17"/>
-        <w:jc w:val="both"/>
-        <w:rPr>
-          <w:rFonts w:asciiTheme="majorHAnsi" w:eastAsia="Times New Roman" w:hAnsiTheme="majorHAnsi" w:cstheme="majorHAnsi"/>
-          <w:b/>
-          <w:bCs/>
-          <w:color w:val="000000"/>
-          <w:sz w:val="24"/>
-          <w:szCs w:val="24"/>
-        </w:rPr>
-      </w:pPr>
-    </w:p>
-    <w:p>
-      <w:pPr>
-        <w:widowControl w:val="0"/>
-        <w:numPr>
-          <w:ilvl w:val="0"/>
-          <w:numId w:val="11"/>
-        </w:numPr>
-        <w:pBdr>
-          <w:top w:val="nil"/>
-          <w:left w:val="nil"/>
-          <w:bottom w:val="nil"/>
-          <w:right w:val="nil"/>
-          <w:between w:val="nil"/>
-        </w:pBdr>
-        <w:spacing w:before="5" w:line="229" w:lineRule="auto"/>
-        <w:ind w:right="17"/>
-        <w:jc w:val="both"/>
-        <w:rPr>
-          <w:rFonts w:asciiTheme="majorHAnsi" w:eastAsia="Times New Roman" w:hAnsiTheme="majorHAnsi" w:cstheme="majorHAnsi"/>
-          <w:color w:val="000000"/>
-          <w:sz w:val="24"/>
-          <w:szCs w:val="24"/>
-        </w:rPr>
-      </w:pPr>
-      <w:r>
-        <w:rPr>
-          <w:rFonts w:asciiTheme="majorHAnsi" w:eastAsia="Times New Roman" w:hAnsiTheme="majorHAnsi" w:cstheme="majorHAnsi"/>
-          <w:b/>
-          <w:bCs/>
-          <w:color w:val="000000"/>
-          <w:sz w:val="24"/>
-          <w:szCs w:val="24"/>
-        </w:rPr>
-        <w:t>Web Framework:</w:t>
-      </w:r>
-      <w:r>
-        <w:rPr>
-          <w:rFonts w:asciiTheme="majorHAnsi" w:eastAsia="Times New Roman" w:hAnsiTheme="majorHAnsi" w:cstheme="majorHAnsi"/>
-          <w:color w:val="000000"/>
-          <w:sz w:val="24"/>
-          <w:szCs w:val="24"/>
-        </w:rPr>
-        <w:t> React.js</w:t>
-      </w:r>
-      <w:r>
-        <w:rPr>
-          <w:rFonts w:asciiTheme="majorHAnsi" w:eastAsia="Times New Roman" w:hAnsiTheme="majorHAnsi" w:cstheme="majorHAnsi"/>
-          <w:color w:val="000000"/>
-          <w:sz w:val="24"/>
-          <w:szCs w:val="24"/>
-        </w:rPr>
-        <w:t xml:space="preserve"> </w:t>
-      </w:r>
-    </w:p>
-    <w:p>
-      <w:pPr>
-        <w:widowControl w:val="0"/>
-        <w:pBdr>
-          <w:top w:val="nil"/>
-          <w:left w:val="nil"/>
-          <w:bottom w:val="nil"/>
-          <w:right w:val="nil"/>
-          <w:between w:val="nil"/>
-        </w:pBdr>
-        <w:spacing w:before="5" w:line="229" w:lineRule="auto"/>
-        <w:ind w:left="360" w:right="17"/>
-        <w:jc w:val="both"/>
-        <w:rPr>
-          <w:rFonts w:asciiTheme="majorHAnsi" w:eastAsia="Times New Roman" w:hAnsiTheme="majorHAnsi" w:cstheme="majorHAnsi"/>
-          <w:color w:val="000000"/>
-          <w:sz w:val="24"/>
-          <w:szCs w:val="24"/>
-        </w:rPr>
-      </w:pPr>
-    </w:p>
-    <w:p>
-      <w:pPr>
-        <w:widowControl w:val="0"/>
-        <w:pBdr>
-          <w:top w:val="nil"/>
-          <w:left w:val="nil"/>
-          <w:bottom w:val="nil"/>
-          <w:right w:val="nil"/>
-          <w:between w:val="nil"/>
-        </w:pBdr>
-        <w:spacing w:before="5" w:line="229" w:lineRule="auto"/>
-        <w:ind w:right="17"/>
-        <w:jc w:val="both"/>
-        <w:rPr>
-          <w:rFonts w:asciiTheme="majorHAnsi" w:eastAsia="Times New Roman" w:hAnsiTheme="majorHAnsi" w:cstheme="majorHAnsi"/>
-          <w:color w:val="000000"/>
-          <w:sz w:val="24"/>
-          <w:szCs w:val="24"/>
-        </w:rPr>
-      </w:pPr>
-      <w:r>
-        <w:rPr>
-          <w:rFonts w:asciiTheme="majorHAnsi" w:eastAsia="Times New Roman" w:hAnsiTheme="majorHAnsi" w:cstheme="majorHAnsi"/>
-          <w:b/>
-          <w:bCs/>
-          <w:color w:val="000000"/>
-          <w:sz w:val="24"/>
-          <w:szCs w:val="24"/>
-        </w:rPr>
-        <w:t xml:space="preserve">Cloud </w:t>
-      </w:r>
-      <w:r>
-        <w:rPr>
-          <w:rFonts w:asciiTheme="majorHAnsi" w:eastAsia="Times New Roman" w:hAnsiTheme="majorHAnsi" w:cstheme="majorHAnsi"/>
-          <w:b/>
-          <w:bCs/>
-          <w:color w:val="000000"/>
-          <w:sz w:val="24"/>
-          <w:szCs w:val="24"/>
-        </w:rPr>
-        <w:t xml:space="preserve">Integration: </w:t>
-      </w:r>
-      <w:r>
-        <w:rPr>
-          <w:rFonts w:asciiTheme="majorHAnsi" w:eastAsia="Times New Roman" w:hAnsiTheme="majorHAnsi" w:cstheme="majorHAnsi"/>
-          <w:color w:val="000000"/>
-          <w:sz w:val="24"/>
-          <w:szCs w:val="24"/>
-        </w:rPr>
-        <w:t>Not decided yet</w:t>
-      </w:r>
-    </w:p>
-    <w:p>
-      <w:pPr>
-        <w:widowControl w:val="0"/>
-        <w:pBdr>
-          <w:top w:val="nil"/>
-          <w:left w:val="nil"/>
-          <w:bottom w:val="nil"/>
-          <w:right w:val="nil"/>
-          <w:between w:val="nil"/>
-        </w:pBdr>
-        <w:spacing w:before="5" w:line="229" w:lineRule="auto"/>
-        <w:ind w:left="20" w:right="17"/>
-        <w:jc w:val="both"/>
-        <w:rPr>
-          <w:rFonts w:asciiTheme="majorHAnsi" w:eastAsia="Times New Roman" w:hAnsiTheme="majorHAnsi" w:cstheme="majorHAnsi"/>
-          <w:b/>
-          <w:bCs/>
-          <w:color w:val="000000"/>
-          <w:sz w:val="24"/>
-          <w:szCs w:val="24"/>
-        </w:rPr>
-      </w:pPr>
-    </w:p>
-    <w:p>
-      <w:pPr>
-        <w:widowControl w:val="0"/>
-        <w:pBdr>
-          <w:top w:val="nil"/>
-          <w:left w:val="nil"/>
-          <w:bottom w:val="nil"/>
-          <w:right w:val="nil"/>
-          <w:between w:val="nil"/>
-        </w:pBdr>
-        <w:spacing w:before="5" w:line="229" w:lineRule="auto"/>
-        <w:ind w:right="17"/>
-        <w:jc w:val="both"/>
-        <w:rPr>
-          <w:rFonts w:asciiTheme="majorHAnsi" w:eastAsia="Times New Roman" w:hAnsiTheme="majorHAnsi" w:cstheme="majorHAnsi"/>
-          <w:b/>
-          <w:bCs/>
-          <w:color w:val="000000"/>
-          <w:sz w:val="24"/>
-          <w:szCs w:val="24"/>
-        </w:rPr>
-      </w:pPr>
-      <w:r>
-        <w:rPr>
-          <w:rFonts w:asciiTheme="majorHAnsi" w:eastAsia="Times New Roman" w:hAnsiTheme="majorHAnsi" w:cstheme="majorHAnsi"/>
-          <w:b/>
-          <w:bCs/>
-          <w:color w:val="000000"/>
-          <w:sz w:val="24"/>
-          <w:szCs w:val="24"/>
-        </w:rPr>
-        <w:t>AI</w:t>
-      </w:r>
-      <w:r>
-        <w:rPr>
-          <w:rFonts w:asciiTheme="majorHAnsi" w:eastAsia="Times New Roman" w:hAnsiTheme="majorHAnsi" w:cstheme="majorHAnsi"/>
-          <w:b/>
-          <w:bCs/>
-          <w:color w:val="000000"/>
-          <w:sz w:val="24"/>
-          <w:szCs w:val="24"/>
-        </w:rPr>
-        <w:t xml:space="preserve"> </w:t>
-      </w:r>
-      <w:r>
-        <w:rPr>
-          <w:rFonts w:asciiTheme="majorHAnsi" w:eastAsia="Times New Roman" w:hAnsiTheme="majorHAnsi" w:cstheme="majorHAnsi"/>
-          <w:b/>
-          <w:bCs/>
-          <w:color w:val="000000"/>
-          <w:sz w:val="24"/>
-          <w:szCs w:val="24"/>
-        </w:rPr>
-        <w:t>Integration</w:t>
-      </w:r>
-      <w:r>
-        <w:rPr>
-          <w:rFonts w:asciiTheme="majorHAnsi" w:eastAsia="Times New Roman" w:hAnsiTheme="majorHAnsi" w:cstheme="majorHAnsi"/>
-          <w:b/>
-          <w:bCs/>
-          <w:color w:val="000000"/>
-          <w:sz w:val="24"/>
-          <w:szCs w:val="24"/>
-        </w:rPr>
-        <w:t xml:space="preserve">: </w:t>
-      </w:r>
-      <w:r>
-        <w:rPr>
-          <w:rFonts w:asciiTheme="majorHAnsi" w:eastAsia="Times New Roman" w:hAnsiTheme="majorHAnsi" w:cstheme="majorHAnsi"/>
-          <w:color w:val="000000"/>
-          <w:sz w:val="24"/>
-          <w:szCs w:val="24"/>
-        </w:rPr>
-        <w:t>Not decided yet</w:t>
-      </w:r>
-    </w:p>
-    <w:p>
-      <w:pPr>
-        <w:widowControl w:val="0"/>
-        <w:pBdr>
-          <w:top w:val="nil"/>
-          <w:left w:val="nil"/>
-          <w:bottom w:val="nil"/>
-          <w:right w:val="nil"/>
-          <w:between w:val="nil"/>
-        </w:pBdr>
-        <w:spacing w:before="5" w:line="229" w:lineRule="auto"/>
-        <w:ind w:left="20" w:right="17"/>
-        <w:jc w:val="both"/>
-        <w:rPr>
-          <w:rFonts w:ascii="Times New Roman" w:eastAsia="Times New Roman" w:hAnsi="Times New Roman" w:cs="Times New Roman"/>
-          <w:b/>
-          <w:bCs/>
-          <w:color w:val="000000"/>
-          <w:sz w:val="24"/>
-          <w:szCs w:val="24"/>
-        </w:rPr>
-      </w:pPr>
-    </w:p>
-    <w:p>
-      <w:pPr>
-        <w:widowControl w:val="0"/>
-        <w:pBdr>
-          <w:top w:val="nil"/>
-          <w:left w:val="nil"/>
-          <w:bottom w:val="nil"/>
-          <w:right w:val="nil"/>
-          <w:between w:val="nil"/>
-        </w:pBdr>
-        <w:spacing w:before="5" w:line="229" w:lineRule="auto"/>
-        <w:ind w:left="720" w:right="17"/>
-        <w:jc w:val="both"/>
-        <w:rPr>
-          <w:rFonts w:ascii="Times New Roman" w:eastAsia="Times New Roman" w:hAnsi="Times New Roman" w:cs="Times New Roman"/>
-          <w:color w:val="000000"/>
-          <w:sz w:val="24"/>
-          <w:szCs w:val="24"/>
-        </w:rPr>
-      </w:pPr>
-    </w:p>
-    <w:p>
-      <w:pPr>
-        <w:widowControl w:val="0"/>
-        <w:pBdr>
-          <w:top w:val="nil"/>
-          <w:left w:val="nil"/>
-          <w:bottom w:val="nil"/>
-          <w:right w:val="nil"/>
-          <w:between w:val="nil"/>
-        </w:pBdr>
-        <w:spacing w:before="5" w:line="229" w:lineRule="auto"/>
-        <w:ind w:left="20" w:right="17"/>
-        <w:jc w:val="both"/>
+      </w:pPr>
+      <w:r>
         <w:rPr>
           <w:rFonts w:asciiTheme="majorHAnsi" w:eastAsia="Times New Roman" w:hAnsiTheme="majorHAnsi" w:cstheme="majorHAnsi"/>
           <w:b/>
@@ -2792,7 +2714,8 @@
           <w:sz w:val="32"/>
           <w:szCs w:val="32"/>
         </w:rPr>
-      </w:pPr>
+        <w:t>4. Use Cases</w:t>
+      </w:r>
       <w:r>
         <w:rPr>
           <w:rFonts w:asciiTheme="majorHAnsi" w:eastAsia="Times New Roman" w:hAnsiTheme="majorHAnsi" w:cstheme="majorHAnsi"/>
@@ -2802,9 +2725,22 @@
           <w:sz w:val="32"/>
           <w:szCs w:val="32"/>
         </w:rPr>
-        <w:t xml:space="preserve">4. </w:t>
-      </w:r>
-      <w:r>
+        <w:t>:</w:t>
+      </w:r>
+    </w:p>
+    <w:p>
+      <w:pPr>
+        <w:widowControl w:val="0"/>
+        <w:pBdr>
+          <w:top w:val="nil"/>
+          <w:left w:val="nil"/>
+          <w:bottom w:val="nil"/>
+          <w:right w:val="nil"/>
+          <w:between w:val="nil"/>
+        </w:pBdr>
+        <w:spacing w:before="5" w:line="229" w:lineRule="auto"/>
+        <w:ind w:left="20" w:right="17"/>
+        <w:jc w:val="both"/>
         <w:rPr>
           <w:rFonts w:asciiTheme="majorHAnsi" w:eastAsia="Times New Roman" w:hAnsiTheme="majorHAnsi" w:cstheme="majorHAnsi"/>
           <w:b/>
@@ -2813,9 +2749,198 @@
           <w:sz w:val="32"/>
           <w:szCs w:val="32"/>
         </w:rPr>
-        <w:t>Use Cases</w:t>
-      </w:r>
-      <w:r>
+      </w:pPr>
+    </w:p>
+    <w:p>
+      <w:pPr>
+        <w:widowControl w:val="0"/>
+        <w:numPr>
+          <w:ilvl w:val="0"/>
+          <w:numId w:val="17"/>
+        </w:numPr>
+        <w:pBdr>
+          <w:top w:val="nil"/>
+          <w:left w:val="nil"/>
+          <w:bottom w:val="nil"/>
+          <w:right w:val="nil"/>
+          <w:between w:val="nil"/>
+        </w:pBdr>
+        <w:spacing w:before="5" w:line="229" w:lineRule="auto"/>
+        <w:ind w:right="17"/>
+        <w:jc w:val="both"/>
+        <w:rPr>
+          <w:rFonts w:asciiTheme="majorHAnsi" w:eastAsia="Times New Roman" w:hAnsiTheme="majorHAnsi" w:cstheme="majorHAnsi"/>
+          <w:color w:val="000000"/>
+          <w:sz w:val="24"/>
+          <w:szCs w:val="24"/>
+        </w:rPr>
+      </w:pPr>
+      <w:r>
+        <w:rPr>
+          <w:rFonts w:asciiTheme="majorHAnsi" w:eastAsia="Times New Roman" w:hAnsiTheme="majorHAnsi" w:cstheme="majorHAnsi"/>
+          <w:b/>
+          <w:bCs/>
+          <w:color w:val="000000"/>
+          <w:sz w:val="24"/>
+          <w:szCs w:val="24"/>
+        </w:rPr>
+        <w:t>Hospitals:</w:t>
+      </w:r>
+      <w:r>
+        <w:rPr>
+          <w:rFonts w:asciiTheme="majorHAnsi" w:eastAsia="Times New Roman" w:hAnsiTheme="majorHAnsi" w:cstheme="majorHAnsi"/>
+          <w:color w:val="000000"/>
+          <w:sz w:val="24"/>
+          <w:szCs w:val="24"/>
+        </w:rPr>
+        <w:t> Manage beds, equipment, and staff for efficient patient care.</w:t>
+      </w:r>
+    </w:p>
+    <w:p>
+      <w:pPr>
+        <w:widowControl w:val="0"/>
+        <w:numPr>
+          <w:ilvl w:val="0"/>
+          <w:numId w:val="17"/>
+        </w:numPr>
+        <w:pBdr>
+          <w:top w:val="nil"/>
+          <w:left w:val="nil"/>
+          <w:bottom w:val="nil"/>
+          <w:right w:val="nil"/>
+          <w:between w:val="nil"/>
+        </w:pBdr>
+        <w:spacing w:before="5" w:line="229" w:lineRule="auto"/>
+        <w:ind w:right="17"/>
+        <w:jc w:val="both"/>
+        <w:rPr>
+          <w:rFonts w:asciiTheme="majorHAnsi" w:eastAsia="Times New Roman" w:hAnsiTheme="majorHAnsi" w:cstheme="majorHAnsi"/>
+          <w:color w:val="000000"/>
+          <w:sz w:val="24"/>
+          <w:szCs w:val="24"/>
+        </w:rPr>
+      </w:pPr>
+      <w:r>
+        <w:rPr>
+          <w:rFonts w:asciiTheme="majorHAnsi" w:eastAsia="Times New Roman" w:hAnsiTheme="majorHAnsi" w:cstheme="majorHAnsi"/>
+          <w:b/>
+          <w:bCs/>
+          <w:color w:val="000000"/>
+          <w:sz w:val="24"/>
+          <w:szCs w:val="24"/>
+        </w:rPr>
+        <w:t>Clinics:</w:t>
+      </w:r>
+      <w:r>
+        <w:rPr>
+          <w:rFonts w:asciiTheme="majorHAnsi" w:eastAsia="Times New Roman" w:hAnsiTheme="majorHAnsi" w:cstheme="majorHAnsi"/>
+          <w:color w:val="000000"/>
+          <w:sz w:val="24"/>
+          <w:szCs w:val="24"/>
+        </w:rPr>
+        <w:t> Schedule appointments and allocate resources for outpatient services.</w:t>
+      </w:r>
+    </w:p>
+    <w:p>
+      <w:pPr>
+        <w:widowControl w:val="0"/>
+        <w:numPr>
+          <w:ilvl w:val="0"/>
+          <w:numId w:val="17"/>
+        </w:numPr>
+        <w:pBdr>
+          <w:top w:val="nil"/>
+          <w:left w:val="nil"/>
+          <w:bottom w:val="nil"/>
+          <w:right w:val="nil"/>
+          <w:between w:val="nil"/>
+        </w:pBdr>
+        <w:spacing w:before="5" w:line="229" w:lineRule="auto"/>
+        <w:ind w:right="17"/>
+        <w:jc w:val="both"/>
+        <w:rPr>
+          <w:rFonts w:asciiTheme="majorHAnsi" w:eastAsia="Times New Roman" w:hAnsiTheme="majorHAnsi" w:cstheme="majorHAnsi"/>
+          <w:color w:val="000000"/>
+          <w:sz w:val="24"/>
+          <w:szCs w:val="24"/>
+        </w:rPr>
+      </w:pPr>
+      <w:r>
+        <w:rPr>
+          <w:rFonts w:asciiTheme="majorHAnsi" w:eastAsia="Times New Roman" w:hAnsiTheme="majorHAnsi" w:cstheme="majorHAnsi"/>
+          <w:b/>
+          <w:bCs/>
+          <w:color w:val="000000"/>
+          <w:sz w:val="24"/>
+          <w:szCs w:val="24"/>
+        </w:rPr>
+        <w:t>Emergency Rooms:</w:t>
+      </w:r>
+      <w:r>
+        <w:rPr>
+          <w:rFonts w:asciiTheme="majorHAnsi" w:eastAsia="Times New Roman" w:hAnsiTheme="majorHAnsi" w:cstheme="majorHAnsi"/>
+          <w:color w:val="000000"/>
+          <w:sz w:val="24"/>
+          <w:szCs w:val="24"/>
+        </w:rPr>
+        <w:t> Track and allocate resources in real-time during emergencies.</w:t>
+      </w:r>
+    </w:p>
+    <w:p>
+      <w:pPr>
+        <w:widowControl w:val="0"/>
+        <w:pBdr>
+          <w:top w:val="nil"/>
+          <w:left w:val="nil"/>
+          <w:bottom w:val="nil"/>
+          <w:right w:val="nil"/>
+          <w:between w:val="nil"/>
+        </w:pBdr>
+        <w:spacing w:before="5" w:line="229" w:lineRule="auto"/>
+        <w:ind w:right="17"/>
+        <w:jc w:val="both"/>
+        <w:rPr>
+          <w:rFonts w:asciiTheme="majorHAnsi" w:eastAsia="Times New Roman" w:hAnsiTheme="majorHAnsi" w:cstheme="majorHAnsi"/>
+          <w:color w:val="000000"/>
+          <w:sz w:val="24"/>
+          <w:szCs w:val="24"/>
+        </w:rPr>
+      </w:pPr>
+    </w:p>
+    <w:p>
+      <w:pPr>
+        <w:widowControl w:val="0"/>
+        <w:pBdr>
+          <w:top w:val="nil"/>
+          <w:left w:val="nil"/>
+          <w:bottom w:val="nil"/>
+          <w:right w:val="nil"/>
+          <w:between w:val="nil"/>
+        </w:pBdr>
+        <w:spacing w:before="5" w:line="229" w:lineRule="auto"/>
+        <w:ind w:right="17"/>
+        <w:jc w:val="both"/>
+        <w:rPr>
+          <w:rFonts w:asciiTheme="majorHAnsi" w:eastAsia="Times New Roman" w:hAnsiTheme="majorHAnsi" w:cstheme="majorHAnsi"/>
+          <w:color w:val="000000"/>
+          <w:sz w:val="24"/>
+          <w:szCs w:val="24"/>
+        </w:rPr>
+      </w:pPr>
+    </w:p>
+    <w:p>
+      <w:pPr>
+        <w:widowControl w:val="0"/>
+        <w:pBdr>
+          <w:top w:val="nil"/>
+          <w:left w:val="nil"/>
+          <w:bottom w:val="nil"/>
+          <w:right w:val="nil"/>
+          <w:between w:val="nil"/>
+        </w:pBdr>
+        <w:spacing w:before="5" w:line="229" w:lineRule="auto"/>
+        <w:ind w:right="17"/>
+        <w:jc w:val="both"/>
         <w:rPr>
           <w:rFonts w:asciiTheme="majorHAnsi" w:eastAsia="Times New Roman" w:hAnsiTheme="majorHAnsi" w:cstheme="majorHAnsi"/>
           <w:b/>
@@ -2824,22 +2949,8 @@
           <w:sz w:val="32"/>
           <w:szCs w:val="32"/>
         </w:rPr>
-        <w:t>:</w:t>
-      </w:r>
-    </w:p>
-    <w:p>
-      <w:pPr>
-        <w:widowControl w:val="0"/>
-        <w:pBdr>
-          <w:top w:val="nil"/>
-          <w:left w:val="nil"/>
-          <w:bottom w:val="nil"/>
-          <w:right w:val="nil"/>
-          <w:between w:val="nil"/>
-        </w:pBdr>
-        <w:spacing w:before="5" w:line="229" w:lineRule="auto"/>
-        <w:ind w:left="20" w:right="17"/>
-        <w:jc w:val="both"/>
+      </w:pPr>
+      <w:r>
         <w:rPr>
           <w:rFonts w:asciiTheme="majorHAnsi" w:eastAsia="Times New Roman" w:hAnsiTheme="majorHAnsi" w:cstheme="majorHAnsi"/>
           <w:b/>
@@ -2848,198 +2959,9 @@
           <w:sz w:val="32"/>
           <w:szCs w:val="32"/>
         </w:rPr>
-      </w:pPr>
-    </w:p>
-    <w:p>
-      <w:pPr>
-        <w:widowControl w:val="0"/>
-        <w:numPr>
-          <w:ilvl w:val="0"/>
-          <w:numId w:val="17"/>
-        </w:numPr>
-        <w:pBdr>
-          <w:top w:val="nil"/>
-          <w:left w:val="nil"/>
-          <w:bottom w:val="nil"/>
-          <w:right w:val="nil"/>
-          <w:between w:val="nil"/>
-        </w:pBdr>
-        <w:spacing w:before="5" w:line="229" w:lineRule="auto"/>
-        <w:ind w:right="17"/>
-        <w:jc w:val="both"/>
-        <w:rPr>
-          <w:rFonts w:asciiTheme="majorHAnsi" w:eastAsia="Times New Roman" w:hAnsiTheme="majorHAnsi" w:cstheme="majorHAnsi"/>
-          <w:color w:val="000000"/>
-          <w:sz w:val="24"/>
-          <w:szCs w:val="24"/>
-        </w:rPr>
-      </w:pPr>
-      <w:r>
-        <w:rPr>
-          <w:rFonts w:asciiTheme="majorHAnsi" w:eastAsia="Times New Roman" w:hAnsiTheme="majorHAnsi" w:cstheme="majorHAnsi"/>
-          <w:b/>
-          <w:bCs/>
-          <w:color w:val="000000"/>
-          <w:sz w:val="24"/>
-          <w:szCs w:val="24"/>
-        </w:rPr>
-        <w:t>Hospitals:</w:t>
-      </w:r>
-      <w:r>
-        <w:rPr>
-          <w:rFonts w:asciiTheme="majorHAnsi" w:eastAsia="Times New Roman" w:hAnsiTheme="majorHAnsi" w:cstheme="majorHAnsi"/>
-          <w:color w:val="000000"/>
-          <w:sz w:val="24"/>
-          <w:szCs w:val="24"/>
-        </w:rPr>
-        <w:t> Manage beds, equipment, and staff for efficient patient care.</w:t>
-      </w:r>
-    </w:p>
-    <w:p>
-      <w:pPr>
-        <w:widowControl w:val="0"/>
-        <w:numPr>
-          <w:ilvl w:val="0"/>
-          <w:numId w:val="17"/>
-        </w:numPr>
-        <w:pBdr>
-          <w:top w:val="nil"/>
-          <w:left w:val="nil"/>
-          <w:bottom w:val="nil"/>
-          <w:right w:val="nil"/>
-          <w:between w:val="nil"/>
-        </w:pBdr>
-        <w:spacing w:before="5" w:line="229" w:lineRule="auto"/>
-        <w:ind w:right="17"/>
-        <w:jc w:val="both"/>
-        <w:rPr>
-          <w:rFonts w:asciiTheme="majorHAnsi" w:eastAsia="Times New Roman" w:hAnsiTheme="majorHAnsi" w:cstheme="majorHAnsi"/>
-          <w:color w:val="000000"/>
-          <w:sz w:val="24"/>
-          <w:szCs w:val="24"/>
-        </w:rPr>
-      </w:pPr>
-      <w:r>
-        <w:rPr>
-          <w:rFonts w:asciiTheme="majorHAnsi" w:eastAsia="Times New Roman" w:hAnsiTheme="majorHAnsi" w:cstheme="majorHAnsi"/>
-          <w:b/>
-          <w:bCs/>
-          <w:color w:val="000000"/>
-          <w:sz w:val="24"/>
-          <w:szCs w:val="24"/>
-        </w:rPr>
-        <w:t>Clinics:</w:t>
-      </w:r>
-      <w:r>
-        <w:rPr>
-          <w:rFonts w:asciiTheme="majorHAnsi" w:eastAsia="Times New Roman" w:hAnsiTheme="majorHAnsi" w:cstheme="majorHAnsi"/>
-          <w:color w:val="000000"/>
-          <w:sz w:val="24"/>
-          <w:szCs w:val="24"/>
-        </w:rPr>
-        <w:t> Schedule appointments and allocate resources for outpatient services.</w:t>
-      </w:r>
-    </w:p>
-    <w:p>
-      <w:pPr>
-        <w:widowControl w:val="0"/>
-        <w:numPr>
-          <w:ilvl w:val="0"/>
-          <w:numId w:val="17"/>
-        </w:numPr>
-        <w:pBdr>
-          <w:top w:val="nil"/>
-          <w:left w:val="nil"/>
-          <w:bottom w:val="nil"/>
-          <w:right w:val="nil"/>
-          <w:between w:val="nil"/>
-        </w:pBdr>
-        <w:spacing w:before="5" w:line="229" w:lineRule="auto"/>
-        <w:ind w:right="17"/>
-        <w:jc w:val="both"/>
-        <w:rPr>
-          <w:rFonts w:asciiTheme="majorHAnsi" w:eastAsia="Times New Roman" w:hAnsiTheme="majorHAnsi" w:cstheme="majorHAnsi"/>
-          <w:color w:val="000000"/>
-          <w:sz w:val="24"/>
-          <w:szCs w:val="24"/>
-        </w:rPr>
-      </w:pPr>
-      <w:r>
-        <w:rPr>
-          <w:rFonts w:asciiTheme="majorHAnsi" w:eastAsia="Times New Roman" w:hAnsiTheme="majorHAnsi" w:cstheme="majorHAnsi"/>
-          <w:b/>
-          <w:bCs/>
-          <w:color w:val="000000"/>
-          <w:sz w:val="24"/>
-          <w:szCs w:val="24"/>
-        </w:rPr>
-        <w:t>Emergency Rooms:</w:t>
-      </w:r>
-      <w:r>
-        <w:rPr>
-          <w:rFonts w:asciiTheme="majorHAnsi" w:eastAsia="Times New Roman" w:hAnsiTheme="majorHAnsi" w:cstheme="majorHAnsi"/>
-          <w:color w:val="000000"/>
-          <w:sz w:val="24"/>
-          <w:szCs w:val="24"/>
-        </w:rPr>
-        <w:t> Track and allocate resources in real-time during emergencies.</w:t>
-      </w:r>
-    </w:p>
-    <w:p>
-      <w:pPr>
-        <w:widowControl w:val="0"/>
-        <w:pBdr>
-          <w:top w:val="nil"/>
-          <w:left w:val="nil"/>
-          <w:bottom w:val="nil"/>
-          <w:right w:val="nil"/>
-          <w:between w:val="nil"/>
-        </w:pBdr>
-        <w:spacing w:before="5" w:line="229" w:lineRule="auto"/>
-        <w:ind w:right="17"/>
-        <w:jc w:val="both"/>
-        <w:rPr>
-          <w:rFonts w:asciiTheme="majorHAnsi" w:eastAsia="Times New Roman" w:hAnsiTheme="majorHAnsi" w:cstheme="majorHAnsi"/>
-          <w:color w:val="000000"/>
-          <w:sz w:val="24"/>
-          <w:szCs w:val="24"/>
-        </w:rPr>
-      </w:pPr>
-    </w:p>
-    <w:p>
-      <w:pPr>
-        <w:widowControl w:val="0"/>
-        <w:pBdr>
-          <w:top w:val="nil"/>
-          <w:left w:val="nil"/>
-          <w:bottom w:val="nil"/>
-          <w:right w:val="nil"/>
-          <w:between w:val="nil"/>
-        </w:pBdr>
-        <w:spacing w:before="5" w:line="229" w:lineRule="auto"/>
-        <w:ind w:right="17"/>
-        <w:jc w:val="both"/>
-        <w:rPr>
-          <w:rFonts w:asciiTheme="majorHAnsi" w:eastAsia="Times New Roman" w:hAnsiTheme="majorHAnsi" w:cstheme="majorHAnsi"/>
-          <w:color w:val="000000"/>
-          <w:sz w:val="24"/>
-          <w:szCs w:val="24"/>
-        </w:rPr>
-      </w:pPr>
-    </w:p>
-    <w:p>
-      <w:pPr>
-        <w:widowControl w:val="0"/>
-        <w:pBdr>
-          <w:top w:val="nil"/>
-          <w:left w:val="nil"/>
-          <w:bottom w:val="nil"/>
-          <w:right w:val="nil"/>
-          <w:between w:val="nil"/>
-        </w:pBdr>
-        <w:spacing w:before="5" w:line="229" w:lineRule="auto"/>
-        <w:ind w:right="17"/>
-        <w:jc w:val="both"/>
+        <w:t xml:space="preserve">5. </w:t>
+      </w:r>
+      <w:r>
         <w:rPr>
           <w:rFonts w:asciiTheme="majorHAnsi" w:eastAsia="Times New Roman" w:hAnsiTheme="majorHAnsi" w:cstheme="majorHAnsi"/>
           <w:b/>
@@ -3048,7 +2970,8 @@
           <w:sz w:val="32"/>
           <w:szCs w:val="32"/>
         </w:rPr>
-      </w:pPr>
+        <w:t>Benefits</w:t>
+      </w:r>
       <w:r>
         <w:rPr>
           <w:rFonts w:asciiTheme="majorHAnsi" w:eastAsia="Times New Roman" w:hAnsiTheme="majorHAnsi" w:cstheme="majorHAnsi"/>
@@ -3058,9 +2981,22 @@
           <w:sz w:val="32"/>
           <w:szCs w:val="32"/>
         </w:rPr>
-        <w:t xml:space="preserve">5. </w:t>
-      </w:r>
-      <w:r>
+        <w:t>:</w:t>
+      </w:r>
+    </w:p>
+    <w:p>
+      <w:pPr>
+        <w:widowControl w:val="0"/>
+        <w:pBdr>
+          <w:top w:val="nil"/>
+          <w:left w:val="nil"/>
+          <w:bottom w:val="nil"/>
+          <w:right w:val="nil"/>
+          <w:between w:val="nil"/>
+        </w:pBdr>
+        <w:spacing w:before="5" w:line="229" w:lineRule="auto"/>
+        <w:ind w:right="17"/>
+        <w:jc w:val="both"/>
         <w:rPr>
           <w:rFonts w:asciiTheme="majorHAnsi" w:eastAsia="Times New Roman" w:hAnsiTheme="majorHAnsi" w:cstheme="majorHAnsi"/>
           <w:b/>
@@ -3069,9 +3005,224 @@
           <w:sz w:val="32"/>
           <w:szCs w:val="32"/>
         </w:rPr>
-        <w:t>Benefits</w:t>
-      </w:r>
-      <w:r>
+      </w:pPr>
+    </w:p>
+    <w:p>
+      <w:pPr>
+        <w:widowControl w:val="0"/>
+        <w:numPr>
+          <w:ilvl w:val="0"/>
+          <w:numId w:val="16"/>
+        </w:numPr>
+        <w:pBdr>
+          <w:top w:val="nil"/>
+          <w:left w:val="nil"/>
+          <w:bottom w:val="nil"/>
+          <w:right w:val="nil"/>
+          <w:between w:val="nil"/>
+        </w:pBdr>
+        <w:spacing w:before="5" w:line="229" w:lineRule="auto"/>
+        <w:ind w:right="17"/>
+        <w:jc w:val="both"/>
+        <w:rPr>
+          <w:rFonts w:asciiTheme="majorHAnsi" w:eastAsia="Times New Roman" w:hAnsiTheme="majorHAnsi" w:cstheme="majorHAnsi"/>
+          <w:color w:val="000000"/>
+          <w:sz w:val="24"/>
+          <w:szCs w:val="24"/>
+        </w:rPr>
+      </w:pPr>
+      <w:r>
+        <w:rPr>
+          <w:rFonts w:asciiTheme="majorHAnsi" w:eastAsia="Times New Roman" w:hAnsiTheme="majorHAnsi" w:cstheme="majorHAnsi"/>
+          <w:b/>
+          <w:bCs/>
+          <w:color w:val="000000"/>
+          <w:sz w:val="24"/>
+          <w:szCs w:val="24"/>
+        </w:rPr>
+        <w:t>Improved Efficiency:</w:t>
+      </w:r>
+      <w:r>
+        <w:rPr>
+          <w:rFonts w:asciiTheme="majorHAnsi" w:eastAsia="Times New Roman" w:hAnsiTheme="majorHAnsi" w:cstheme="majorHAnsi"/>
+          <w:color w:val="000000"/>
+          <w:sz w:val="24"/>
+          <w:szCs w:val="24"/>
+        </w:rPr>
+        <w:t> Optimize resource utilization and reduce wait times.</w:t>
+      </w:r>
+    </w:p>
+    <w:p>
+      <w:pPr>
+        <w:widowControl w:val="0"/>
+        <w:numPr>
+          <w:ilvl w:val="0"/>
+          <w:numId w:val="16"/>
+        </w:numPr>
+        <w:pBdr>
+          <w:top w:val="nil"/>
+          <w:left w:val="nil"/>
+          <w:bottom w:val="nil"/>
+          <w:right w:val="nil"/>
+          <w:between w:val="nil"/>
+        </w:pBdr>
+        <w:spacing w:before="5" w:line="229" w:lineRule="auto"/>
+        <w:ind w:right="17"/>
+        <w:jc w:val="both"/>
+        <w:rPr>
+          <w:rFonts w:asciiTheme="majorHAnsi" w:eastAsia="Times New Roman" w:hAnsiTheme="majorHAnsi" w:cstheme="majorHAnsi"/>
+          <w:color w:val="000000"/>
+          <w:sz w:val="24"/>
+          <w:szCs w:val="24"/>
+        </w:rPr>
+      </w:pPr>
+      <w:r>
+        <w:rPr>
+          <w:rFonts w:asciiTheme="majorHAnsi" w:eastAsia="Times New Roman" w:hAnsiTheme="majorHAnsi" w:cstheme="majorHAnsi"/>
+          <w:b/>
+          <w:bCs/>
+          <w:color w:val="000000"/>
+          <w:sz w:val="24"/>
+          <w:szCs w:val="24"/>
+        </w:rPr>
+        <w:t>Enhanced Patient Care:</w:t>
+      </w:r>
+      <w:r>
+        <w:rPr>
+          <w:rFonts w:asciiTheme="majorHAnsi" w:eastAsia="Times New Roman" w:hAnsiTheme="majorHAnsi" w:cstheme="majorHAnsi"/>
+          <w:color w:val="000000"/>
+          <w:sz w:val="24"/>
+          <w:szCs w:val="24"/>
+        </w:rPr>
+        <w:t> Ensure that patients receive timely and appropriate care.</w:t>
+      </w:r>
+    </w:p>
+    <w:p>
+      <w:pPr>
+        <w:widowControl w:val="0"/>
+        <w:numPr>
+          <w:ilvl w:val="0"/>
+          <w:numId w:val="16"/>
+        </w:numPr>
+        <w:pBdr>
+          <w:top w:val="nil"/>
+          <w:left w:val="nil"/>
+          <w:bottom w:val="nil"/>
+          <w:right w:val="nil"/>
+          <w:between w:val="nil"/>
+        </w:pBdr>
+        <w:spacing w:before="5" w:line="229" w:lineRule="auto"/>
+        <w:ind w:right="17"/>
+        <w:jc w:val="both"/>
+        <w:rPr>
+          <w:rFonts w:asciiTheme="majorHAnsi" w:eastAsia="Times New Roman" w:hAnsiTheme="majorHAnsi" w:cstheme="majorHAnsi"/>
+          <w:color w:val="000000"/>
+          <w:sz w:val="24"/>
+          <w:szCs w:val="24"/>
+        </w:rPr>
+      </w:pPr>
+      <w:r>
+        <w:rPr>
+          <w:rFonts w:asciiTheme="majorHAnsi" w:eastAsia="Times New Roman" w:hAnsiTheme="majorHAnsi" w:cstheme="majorHAnsi"/>
+          <w:b/>
+          <w:bCs/>
+          <w:color w:val="000000"/>
+          <w:sz w:val="24"/>
+          <w:szCs w:val="24"/>
+        </w:rPr>
+        <w:t>Cost Savings:</w:t>
+      </w:r>
+      <w:r>
+        <w:rPr>
+          <w:rFonts w:asciiTheme="majorHAnsi" w:eastAsia="Times New Roman" w:hAnsiTheme="majorHAnsi" w:cstheme="majorHAnsi"/>
+          <w:color w:val="000000"/>
+          <w:sz w:val="24"/>
+          <w:szCs w:val="24"/>
+        </w:rPr>
+        <w:t> Reduce wastage of resources and improve operational efficiency.</w:t>
+      </w:r>
+    </w:p>
+    <w:p>
+      <w:pPr>
+        <w:widowControl w:val="0"/>
+        <w:numPr>
+          <w:ilvl w:val="0"/>
+          <w:numId w:val="16"/>
+        </w:numPr>
+        <w:pBdr>
+          <w:top w:val="nil"/>
+          <w:left w:val="nil"/>
+          <w:bottom w:val="nil"/>
+          <w:right w:val="nil"/>
+          <w:between w:val="nil"/>
+        </w:pBdr>
+        <w:spacing w:before="5" w:line="229" w:lineRule="auto"/>
+        <w:ind w:right="17"/>
+        <w:jc w:val="both"/>
+        <w:rPr>
+          <w:rFonts w:asciiTheme="majorHAnsi" w:eastAsia="Times New Roman" w:hAnsiTheme="majorHAnsi" w:cstheme="majorHAnsi"/>
+          <w:color w:val="000000"/>
+          <w:sz w:val="24"/>
+          <w:szCs w:val="24"/>
+        </w:rPr>
+      </w:pPr>
+      <w:r>
+        <w:rPr>
+          <w:rFonts w:asciiTheme="majorHAnsi" w:eastAsia="Times New Roman" w:hAnsiTheme="majorHAnsi" w:cstheme="majorHAnsi"/>
+          <w:b/>
+          <w:bCs/>
+          <w:color w:val="000000"/>
+          <w:sz w:val="24"/>
+          <w:szCs w:val="24"/>
+        </w:rPr>
+        <w:t>Data-Driven Decisions:</w:t>
+      </w:r>
+      <w:r>
+        <w:rPr>
+          <w:rFonts w:asciiTheme="majorHAnsi" w:eastAsia="Times New Roman" w:hAnsiTheme="majorHAnsi" w:cstheme="majorHAnsi"/>
+          <w:color w:val="000000"/>
+          <w:sz w:val="24"/>
+          <w:szCs w:val="24"/>
+        </w:rPr>
+        <w:t> Use analytics to make informed decisions about resource allocation.</w:t>
+      </w:r>
+    </w:p>
+    <w:p>
+      <w:pPr>
+        <w:widowControl w:val="0"/>
+        <w:pBdr>
+          <w:top w:val="nil"/>
+          <w:left w:val="nil"/>
+          <w:bottom w:val="nil"/>
+          <w:right w:val="nil"/>
+          <w:between w:val="nil"/>
+        </w:pBdr>
+        <w:spacing w:before="5" w:line="229" w:lineRule="auto"/>
+        <w:ind w:left="360" w:right="17"/>
+        <w:jc w:val="both"/>
+        <w:rPr>
+          <w:rFonts w:asciiTheme="majorHAnsi" w:eastAsia="Times New Roman" w:hAnsiTheme="majorHAnsi" w:cstheme="majorHAnsi"/>
+          <w:b/>
+          <w:bCs/>
+          <w:color w:val="000000"/>
+          <w:sz w:val="24"/>
+          <w:szCs w:val="24"/>
+        </w:rPr>
+      </w:pPr>
+    </w:p>
+    <w:p>
+      <w:pPr>
+        <w:widowControl w:val="0"/>
+        <w:pBdr>
+          <w:top w:val="nil"/>
+          <w:left w:val="nil"/>
+          <w:bottom w:val="nil"/>
+          <w:right w:val="nil"/>
+          <w:between w:val="nil"/>
+        </w:pBdr>
+        <w:spacing w:before="5" w:line="229" w:lineRule="auto"/>
+        <w:ind w:right="17"/>
+        <w:jc w:val="both"/>
         <w:rPr>
           <w:rFonts w:asciiTheme="majorHAnsi" w:eastAsia="Times New Roman" w:hAnsiTheme="majorHAnsi" w:cstheme="majorHAnsi"/>
           <w:b/>
@@ -3080,22 +3231,8 @@
           <w:sz w:val="32"/>
           <w:szCs w:val="32"/>
         </w:rPr>
-        <w:t>:</w:t>
-      </w:r>
-    </w:p>
-    <w:p>
-      <w:pPr>
-        <w:widowControl w:val="0"/>
-        <w:pBdr>
-          <w:top w:val="nil"/>
-          <w:left w:val="nil"/>
-          <w:bottom w:val="nil"/>
-          <w:right w:val="nil"/>
-          <w:between w:val="nil"/>
-        </w:pBdr>
-        <w:spacing w:before="5" w:line="229" w:lineRule="auto"/>
-        <w:ind w:right="17"/>
-        <w:jc w:val="both"/>
+      </w:pPr>
+      <w:r>
         <w:rPr>
           <w:rFonts w:asciiTheme="majorHAnsi" w:eastAsia="Times New Roman" w:hAnsiTheme="majorHAnsi" w:cstheme="majorHAnsi"/>
           <w:b/>
@@ -3104,276 +3241,7 @@
           <w:sz w:val="32"/>
           <w:szCs w:val="32"/>
         </w:rPr>
-      </w:pPr>
-    </w:p>
-    <w:p>
-      <w:pPr>
-        <w:widowControl w:val="0"/>
-        <w:numPr>
-          <w:ilvl w:val="0"/>
-          <w:numId w:val="16"/>
-        </w:numPr>
-        <w:pBdr>
-          <w:top w:val="nil"/>
-          <w:left w:val="nil"/>
-          <w:bottom w:val="nil"/>
-          <w:right w:val="nil"/>
-          <w:between w:val="nil"/>
-        </w:pBdr>
-        <w:spacing w:before="5" w:line="229" w:lineRule="auto"/>
-        <w:ind w:right="17"/>
-        <w:jc w:val="both"/>
-        <w:rPr>
-          <w:rFonts w:asciiTheme="majorHAnsi" w:eastAsia="Times New Roman" w:hAnsiTheme="majorHAnsi" w:cstheme="majorHAnsi"/>
-          <w:color w:val="000000"/>
-          <w:sz w:val="24"/>
-          <w:szCs w:val="24"/>
-        </w:rPr>
-      </w:pPr>
-      <w:r>
-        <w:rPr>
-          <w:rFonts w:asciiTheme="majorHAnsi" w:eastAsia="Times New Roman" w:hAnsiTheme="majorHAnsi" w:cstheme="majorHAnsi"/>
-          <w:b/>
-          <w:bCs/>
-          <w:color w:val="000000"/>
-          <w:sz w:val="24"/>
-          <w:szCs w:val="24"/>
-        </w:rPr>
-        <w:t>Improved Efficiency:</w:t>
-      </w:r>
-      <w:r>
-        <w:rPr>
-          <w:rFonts w:asciiTheme="majorHAnsi" w:eastAsia="Times New Roman" w:hAnsiTheme="majorHAnsi" w:cstheme="majorHAnsi"/>
-          <w:color w:val="000000"/>
-          <w:sz w:val="24"/>
-          <w:szCs w:val="24"/>
-        </w:rPr>
-        <w:t> Optimize resource utilization and reduce wait times.</w:t>
-      </w:r>
-    </w:p>
-    <w:p>
-      <w:pPr>
-        <w:widowControl w:val="0"/>
-        <w:numPr>
-          <w:ilvl w:val="0"/>
-          <w:numId w:val="16"/>
-        </w:numPr>
-        <w:pBdr>
-          <w:top w:val="nil"/>
-          <w:left w:val="nil"/>
-          <w:bottom w:val="nil"/>
-          <w:right w:val="nil"/>
-          <w:between w:val="nil"/>
-        </w:pBdr>
-        <w:spacing w:before="5" w:line="229" w:lineRule="auto"/>
-        <w:ind w:right="17"/>
-        <w:jc w:val="both"/>
-        <w:rPr>
-          <w:rFonts w:asciiTheme="majorHAnsi" w:eastAsia="Times New Roman" w:hAnsiTheme="majorHAnsi" w:cstheme="majorHAnsi"/>
-          <w:color w:val="000000"/>
-          <w:sz w:val="24"/>
-          <w:szCs w:val="24"/>
-        </w:rPr>
-      </w:pPr>
-      <w:r>
-        <w:rPr>
-          <w:rFonts w:asciiTheme="majorHAnsi" w:eastAsia="Times New Roman" w:hAnsiTheme="majorHAnsi" w:cstheme="majorHAnsi"/>
-          <w:b/>
-          <w:bCs/>
-          <w:color w:val="000000"/>
-          <w:sz w:val="24"/>
-          <w:szCs w:val="24"/>
-        </w:rPr>
-        <w:t>Enhanced Patient Care:</w:t>
-      </w:r>
-      <w:r>
-        <w:rPr>
-          <w:rFonts w:asciiTheme="majorHAnsi" w:eastAsia="Times New Roman" w:hAnsiTheme="majorHAnsi" w:cstheme="majorHAnsi"/>
-          <w:color w:val="000000"/>
-          <w:sz w:val="24"/>
-          <w:szCs w:val="24"/>
-        </w:rPr>
-        <w:t> Ensure that patients receive timely and appropriate care.</w:t>
-      </w:r>
-    </w:p>
-    <w:p>
-      <w:pPr>
-        <w:widowControl w:val="0"/>
-        <w:numPr>
-          <w:ilvl w:val="0"/>
-          <w:numId w:val="16"/>
-        </w:numPr>
-        <w:pBdr>
-          <w:top w:val="nil"/>
-          <w:left w:val="nil"/>
-          <w:bottom w:val="nil"/>
-          <w:right w:val="nil"/>
-          <w:between w:val="nil"/>
-        </w:pBdr>
-        <w:spacing w:before="5" w:line="229" w:lineRule="auto"/>
-        <w:ind w:right="17"/>
-        <w:jc w:val="both"/>
-        <w:rPr>
-          <w:rFonts w:asciiTheme="majorHAnsi" w:eastAsia="Times New Roman" w:hAnsiTheme="majorHAnsi" w:cstheme="majorHAnsi"/>
-          <w:color w:val="000000"/>
-          <w:sz w:val="24"/>
-          <w:szCs w:val="24"/>
-        </w:rPr>
-      </w:pPr>
-      <w:r>
-        <w:rPr>
-          <w:rFonts w:asciiTheme="majorHAnsi" w:eastAsia="Times New Roman" w:hAnsiTheme="majorHAnsi" w:cstheme="majorHAnsi"/>
-          <w:b/>
-          <w:bCs/>
-          <w:color w:val="000000"/>
-          <w:sz w:val="24"/>
-          <w:szCs w:val="24"/>
-        </w:rPr>
-        <w:t>Cost Savings:</w:t>
-      </w:r>
-      <w:r>
-        <w:rPr>
-          <w:rFonts w:asciiTheme="majorHAnsi" w:eastAsia="Times New Roman" w:hAnsiTheme="majorHAnsi" w:cstheme="majorHAnsi"/>
-          <w:color w:val="000000"/>
-          <w:sz w:val="24"/>
-          <w:szCs w:val="24"/>
-        </w:rPr>
-        <w:t> Reduce wastage of resources and improve operational efficiency.</w:t>
-      </w:r>
-    </w:p>
-    <w:p>
-      <w:pPr>
-        <w:widowControl w:val="0"/>
-        <w:numPr>
-          <w:ilvl w:val="0"/>
-          <w:numId w:val="16"/>
-        </w:numPr>
-        <w:pBdr>
-          <w:top w:val="nil"/>
-          <w:left w:val="nil"/>
-          <w:bottom w:val="nil"/>
-          <w:right w:val="nil"/>
-          <w:between w:val="nil"/>
-        </w:pBdr>
-        <w:spacing w:before="5" w:line="229" w:lineRule="auto"/>
-        <w:ind w:right="17"/>
-        <w:jc w:val="both"/>
-        <w:rPr>
-          <w:rFonts w:asciiTheme="majorHAnsi" w:eastAsia="Times New Roman" w:hAnsiTheme="majorHAnsi" w:cstheme="majorHAnsi"/>
-          <w:color w:val="000000"/>
-          <w:sz w:val="24"/>
-          <w:szCs w:val="24"/>
-        </w:rPr>
-      </w:pPr>
-      <w:r>
-        <w:rPr>
-          <w:rFonts w:asciiTheme="majorHAnsi" w:eastAsia="Times New Roman" w:hAnsiTheme="majorHAnsi" w:cstheme="majorHAnsi"/>
-          <w:b/>
-          <w:bCs/>
-          <w:color w:val="000000"/>
-          <w:sz w:val="24"/>
-          <w:szCs w:val="24"/>
-        </w:rPr>
-        <w:t>Data-Driven Decisions:</w:t>
-      </w:r>
-      <w:r>
-        <w:rPr>
-          <w:rFonts w:asciiTheme="majorHAnsi" w:eastAsia="Times New Roman" w:hAnsiTheme="majorHAnsi" w:cstheme="majorHAnsi"/>
-          <w:color w:val="000000"/>
-          <w:sz w:val="24"/>
-          <w:szCs w:val="24"/>
-        </w:rPr>
-        <w:t> Use analytics to make informed decisions about resource allocation.</w:t>
-      </w:r>
-    </w:p>
-    <w:p>
-      <w:pPr>
-        <w:widowControl w:val="0"/>
-        <w:pBdr>
-          <w:top w:val="nil"/>
-          <w:left w:val="nil"/>
-          <w:bottom w:val="nil"/>
-          <w:right w:val="nil"/>
-          <w:between w:val="nil"/>
-        </w:pBdr>
-        <w:spacing w:before="5" w:line="229" w:lineRule="auto"/>
-        <w:ind w:left="360" w:right="17"/>
-        <w:jc w:val="both"/>
-        <w:rPr>
-          <w:rFonts w:asciiTheme="majorHAnsi" w:eastAsia="Times New Roman" w:hAnsiTheme="majorHAnsi" w:cstheme="majorHAnsi"/>
-          <w:b/>
-          <w:bCs/>
-          <w:color w:val="000000"/>
-          <w:sz w:val="24"/>
-          <w:szCs w:val="24"/>
-        </w:rPr>
-      </w:pPr>
-    </w:p>
-    <w:p>
-      <w:pPr>
-        <w:widowControl w:val="0"/>
-        <w:pBdr>
-          <w:top w:val="nil"/>
-          <w:left w:val="nil"/>
-          <w:bottom w:val="nil"/>
-          <w:right w:val="nil"/>
-          <w:between w:val="nil"/>
-        </w:pBdr>
-        <w:spacing w:before="5" w:line="229" w:lineRule="auto"/>
-        <w:ind w:right="17"/>
-        <w:jc w:val="both"/>
-        <w:rPr>
-          <w:rFonts w:asciiTheme="majorHAnsi" w:eastAsia="Times New Roman" w:hAnsiTheme="majorHAnsi" w:cstheme="majorHAnsi"/>
-          <w:b/>
-          <w:bCs/>
-          <w:color w:val="4F81BD" w:themeColor="accent1"/>
-          <w:sz w:val="32"/>
-          <w:szCs w:val="32"/>
-        </w:rPr>
-      </w:pPr>
-      <w:r>
-        <w:rPr>
-          <w:rFonts w:asciiTheme="majorHAnsi" w:eastAsia="Times New Roman" w:hAnsiTheme="majorHAnsi" w:cstheme="majorHAnsi"/>
-          <w:b/>
-          <w:bCs/>
-          <w:color w:val="4F81BD" w:themeColor="accent1"/>
-          <w:sz w:val="32"/>
-          <w:szCs w:val="32"/>
-        </w:rPr>
-        <w:t>6</w:t>
-      </w:r>
-      <w:r>
-        <w:rPr>
-          <w:rFonts w:asciiTheme="majorHAnsi" w:eastAsia="Times New Roman" w:hAnsiTheme="majorHAnsi" w:cstheme="majorHAnsi"/>
-          <w:b/>
-          <w:bCs/>
-          <w:color w:val="4F81BD" w:themeColor="accent1"/>
-          <w:sz w:val="32"/>
-          <w:szCs w:val="32"/>
-        </w:rPr>
-        <w:t xml:space="preserve">. </w:t>
-      </w:r>
-      <w:r>
-        <w:rPr>
-          <w:rFonts w:asciiTheme="majorHAnsi" w:eastAsia="Times New Roman" w:hAnsiTheme="majorHAnsi" w:cstheme="majorHAnsi"/>
-          <w:b/>
-          <w:bCs/>
-          <w:color w:val="4F81BD" w:themeColor="accent1"/>
-          <w:sz w:val="32"/>
-          <w:szCs w:val="32"/>
-        </w:rPr>
-        <w:t>Final Remarks</w:t>
-      </w:r>
-      <w:r>
-        <w:rPr>
-          <w:rFonts w:asciiTheme="majorHAnsi" w:eastAsia="Times New Roman" w:hAnsiTheme="majorHAnsi" w:cstheme="majorHAnsi"/>
-          <w:b/>
-          <w:bCs/>
-          <w:color w:val="4F81BD" w:themeColor="accent1"/>
-          <w:sz w:val="32"/>
-          <w:szCs w:val="32"/>
-        </w:rPr>
-        <w:t>:</w:t>
+        <w:t>6. Final Remarks:</w:t>
       </w:r>
     </w:p>
     <w:p>
@@ -6902,6 +6770,7 @@
   <w:style w:type="character" w:default="1" w:styleId="DefaultParagraphFont">
     <w:name w:val="Default Paragraph Font"/>
     <w:uiPriority w:val="1"/>
+    <w:semiHidden/>
     <w:unhideWhenUsed/>
   </w:style>
   <w:style w:type="table" w:default="1" w:styleId="TableNormal">

</xml_diff>